<commit_message>
docs: cập nhật nội dung báo cáo bài tập lớn
Co-Authored-By: Claude Sonnet 5 <noreply@anthropic.com>
</commit_message>
<xml_diff>
--- a/docs/Bao-cao-bai-tap-lon.docx
+++ b/docs/Bao-cao-bai-tap-lon.docx
@@ -515,94 +515,73 @@
               </wp:anchor>
             </w:drawing>
           </mc:Choice>
-          <mc:Fallback xmlns:wpsCustomData="http://www.wps.cn/officeDocument/2013/wpsCustomData">
+          <mc:Fallback>
             <w:pict>
-              <v:group id="Nhóm 461" o:spid="_x0000_s1026" o:spt="203" style="position:absolute;left:0pt;height:770.85pt;width:501.9pt;mso-position-horizontal:center;mso-position-horizontal-relative:margin;mso-position-vertical:center;mso-position-vertical-relative:margin;z-index:-251657216;mso-width-relative:page;mso-height-relative:page;" coordorigin="1985,1418" coordsize="8820,14097" o:gfxdata="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">
-                <o:lock v:ext="edit" aspectratio="f"/>
-                <v:group id="Group 37" o:spid="_x0000_s1026" o:spt="203" style="position:absolute;left:1985;top:1418;height:1920;width:1905;" coordorigin="1985,1418" coordsize="1905,1920" o:gfxdata="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">
-                  <o:lock v:ext="edit" aspectratio="f"/>
-                  <v:shape id="Picture 38" o:spid="_x0000_s1026" o:spt="75" alt="CRNRC057" type="#_x0000_t75" style="position:absolute;left:1978;top:1425;height:1905;width:1920;rotation:-5898240f;" filled="f" o:preferrelative="t" stroked="f" coordsize="21600,21600" o:gfxdata="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">
-                    <v:fill on="f" focussize="0,0"/>
-                    <v:stroke on="f"/>
-                    <v:imagedata r:id="rId14" o:title=""/>
+              <v:group w14:anchorId="0429C772" id="Nhóm 461" o:spid="_x0000_s1026" style="position:absolute;margin-left:0;margin-top:0;width:501.9pt;height:770.85pt;z-index:-251657216;mso-position-horizontal:center;mso-position-horizontal-relative:margin;mso-position-vertical:center;mso-position-vertical-relative:margin" coordorigin="1985,1418" coordsize="8820,14097" o:gfxdata="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">
+                <v:group id="Group 37" o:spid="_x0000_s1027" style="position:absolute;left:1985;top:1418;width:1905;height:1920" coordorigin="1985,1418" coordsize="1905,1920" o:gfxdata="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">
+                  <v:shapetype id="_x0000_t75" coordsize="21600,21600" o:spt="75" o:preferrelative="t" path="m@4@5l@4@11@9@11@9@5xe" filled="f" stroked="f">
+                    <v:stroke joinstyle="miter"/>
+                    <v:formulas>
+                      <v:f eqn="if lineDrawn pixelLineWidth 0"/>
+                      <v:f eqn="sum @0 1 0"/>
+                      <v:f eqn="sum 0 0 @1"/>
+                      <v:f eqn="prod @2 1 2"/>
+                      <v:f eqn="prod @3 21600 pixelWidth"/>
+                      <v:f eqn="prod @3 21600 pixelHeight"/>
+                      <v:f eqn="sum @0 0 1"/>
+                      <v:f eqn="prod @6 1 2"/>
+                      <v:f eqn="prod @7 21600 pixelWidth"/>
+                      <v:f eqn="sum @8 21600 0"/>
+                      <v:f eqn="prod @7 21600 pixelHeight"/>
+                      <v:f eqn="sum @10 21600 0"/>
+                    </v:formulas>
+                    <v:path o:extrusionok="f" gradientshapeok="t" o:connecttype="rect"/>
                     <o:lock v:ext="edit" aspectratio="t"/>
+                  </v:shapetype>
+                  <v:shape id="Picture 38" o:spid="_x0000_s1028" type="#_x0000_t75" alt="CRNRC057" style="position:absolute;left:1978;top:1425;width:1920;height:1905;rotation:-90;visibility:visible;mso-wrap-style:square" o:gfxdata="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">
+                    <v:imagedata r:id="rId14" o:title="CRNRC057"/>
                   </v:shape>
-                  <v:shape id="Picture 39" o:spid="_x0000_s1026" o:spt="75" alt="CRNRC047" type="#_x0000_t75" style="position:absolute;left:2373;top:1872;height:855;width:870;rotation:-5898240f;" filled="f" o:preferrelative="t" stroked="f" coordsize="21600,21600" o:gfxdata="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">
-                    <v:fill on="f" focussize="0,0"/>
-                    <v:stroke on="f"/>
-                    <v:imagedata r:id="rId15" o:title=""/>
-                    <o:lock v:ext="edit" aspectratio="t"/>
+                  <v:shape id="Picture 39" o:spid="_x0000_s1029" type="#_x0000_t75" alt="CRNRC047" style="position:absolute;left:2373;top:1872;width:870;height:855;rotation:-90;visibility:visible;mso-wrap-style:square" o:gfxdata="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">
+                    <v:imagedata r:id="rId15" o:title="CRNRC047"/>
                   </v:shape>
                 </v:group>
-                <v:shape id="Picture 40" o:spid="_x0000_s1026" o:spt="75" alt="J0105250" type="#_x0000_t75" style="position:absolute;left:3865;top:1544;height:194;width:4860;" filled="f" o:preferrelative="t" stroked="f" coordsize="21600,21600" o:gfxdata="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">
-                  <v:fill on="f" focussize="0,0"/>
-                  <v:stroke on="f"/>
-                  <v:imagedata r:id="rId16" o:title=""/>
-                  <o:lock v:ext="edit" aspectratio="t"/>
+                <v:shape id="Picture 40" o:spid="_x0000_s1030" type="#_x0000_t75" alt="J0105250" style="position:absolute;left:3865;top:1544;width:4860;height:194;visibility:visible;mso-wrap-style:square" o:gfxdata="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">
+                  <v:imagedata r:id="rId16" o:title="J0105250"/>
                 </v:shape>
-                <v:group id="Group 41" o:spid="_x0000_s1026" o:spt="203" style="position:absolute;left:8892;top:1418;height:1920;width:1905;rotation:5898240f;" coordorigin="1985,1418" coordsize="1905,1920" o:gfxdata="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">
-                  <o:lock v:ext="edit" aspectratio="f"/>
-                  <v:shape id="Picture 42" o:spid="_x0000_s1026" o:spt="75" alt="CRNRC057" type="#_x0000_t75" style="position:absolute;left:1978;top:1425;height:1905;width:1920;rotation:-5898240f;" filled="f" o:preferrelative="t" stroked="f" coordsize="21600,21600" o:gfxdata="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">
-                    <v:fill on="f" focussize="0,0"/>
-                    <v:stroke on="f"/>
-                    <v:imagedata r:id="rId17" o:title=""/>
-                    <o:lock v:ext="edit" aspectratio="t"/>
+                <v:group id="Group 41" o:spid="_x0000_s1031" style="position:absolute;left:8892;top:1418;width:1905;height:1920;rotation:90" coordorigin="1985,1418" coordsize="1905,1920" o:gfxdata="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">
+                  <v:shape id="Picture 42" o:spid="_x0000_s1032" type="#_x0000_t75" alt="CRNRC057" style="position:absolute;left:1978;top:1425;width:1920;height:1905;rotation:-90;visibility:visible;mso-wrap-style:square" o:gfxdata="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">
+                    <v:imagedata r:id="rId17" o:title="CRNRC057"/>
                   </v:shape>
-                  <v:shape id="Picture 43" o:spid="_x0000_s1026" o:spt="75" alt="CRNRC047" type="#_x0000_t75" style="position:absolute;left:2373;top:1872;height:855;width:870;rotation:-5898240f;" filled="f" o:preferrelative="t" stroked="f" coordsize="21600,21600" o:gfxdata="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">
-                    <v:fill on="f" focussize="0,0"/>
-                    <v:stroke on="f"/>
-                    <v:imagedata r:id="rId15" o:title=""/>
-                    <o:lock v:ext="edit" aspectratio="t"/>
+                  <v:shape id="Picture 43" o:spid="_x0000_s1033" type="#_x0000_t75" alt="CRNRC047" style="position:absolute;left:2373;top:1872;width:870;height:855;rotation:-90;visibility:visible;mso-wrap-style:square" o:gfxdata="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">
+                    <v:imagedata r:id="rId15" o:title="CRNRC047"/>
                   </v:shape>
                 </v:group>
-                <v:group id="Group 44" o:spid="_x0000_s1026" o:spt="203" style="position:absolute;left:1992;top:13595;height:1920;width:1905;rotation:-5898240f;" coordorigin="1985,1418" coordsize="1905,1920" o:gfxdata="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">
-                  <o:lock v:ext="edit" aspectratio="f"/>
-                  <v:shape id="Picture 45" o:spid="_x0000_s1026" o:spt="75" alt="CRNRC057" type="#_x0000_t75" style="position:absolute;left:1978;top:1425;height:1905;width:1920;rotation:-5898240f;" filled="f" o:preferrelative="t" stroked="f" coordsize="21600,21600" o:gfxdata="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">
-                    <v:fill on="f" focussize="0,0"/>
-                    <v:stroke on="f"/>
-                    <v:imagedata r:id="rId17" o:title=""/>
-                    <o:lock v:ext="edit" aspectratio="t"/>
+                <v:group id="Group 44" o:spid="_x0000_s1034" style="position:absolute;left:1992;top:13595;width:1905;height:1920;rotation:-90" coordorigin="1985,1418" coordsize="1905,1920" o:gfxdata="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">
+                  <v:shape id="Picture 45" o:spid="_x0000_s1035" type="#_x0000_t75" alt="CRNRC057" style="position:absolute;left:1978;top:1425;width:1920;height:1905;rotation:-90;visibility:visible;mso-wrap-style:square" o:gfxdata="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">
+                    <v:imagedata r:id="rId17" o:title="CRNRC057"/>
                   </v:shape>
-                  <v:shape id="Picture 46" o:spid="_x0000_s1026" o:spt="75" alt="CRNRC047" type="#_x0000_t75" style="position:absolute;left:2373;top:1872;height:855;width:870;rotation:-5898240f;" filled="f" o:preferrelative="t" stroked="f" coordsize="21600,21600" o:gfxdata="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">
-                    <v:fill on="f" focussize="0,0"/>
-                    <v:stroke on="f"/>
-                    <v:imagedata r:id="rId15" o:title=""/>
-                    <o:lock v:ext="edit" aspectratio="t"/>
+                  <v:shape id="Picture 46" o:spid="_x0000_s1036" type="#_x0000_t75" alt="CRNRC047" style="position:absolute;left:2373;top:1872;width:870;height:855;rotation:-90;visibility:visible;mso-wrap-style:square" o:gfxdata="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">
+                    <v:imagedata r:id="rId15" o:title="CRNRC047"/>
                   </v:shape>
                 </v:group>
-                <v:group id="Group 47" o:spid="_x0000_s1026" o:spt="203" style="position:absolute;left:8899;top:13595;height:1920;width:1905;rotation:11796480f;" coordorigin="1985,1418" coordsize="1905,1920" o:gfxdata="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">
-                  <o:lock v:ext="edit" aspectratio="f"/>
-                  <v:shape id="Picture 48" o:spid="_x0000_s1026" o:spt="75" alt="CRNRC057" type="#_x0000_t75" style="position:absolute;left:1978;top:1425;height:1905;width:1920;rotation:-5898240f;" filled="f" o:preferrelative="t" stroked="f" coordsize="21600,21600" o:gfxdata="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">
-                    <v:fill on="f" focussize="0,0"/>
-                    <v:stroke on="f"/>
-                    <v:imagedata r:id="rId14" o:title=""/>
-                    <o:lock v:ext="edit" aspectratio="t"/>
+                <v:group id="Group 47" o:spid="_x0000_s1037" style="position:absolute;left:8899;top:13595;width:1905;height:1920;rotation:180" coordorigin="1985,1418" coordsize="1905,1920" o:gfxdata="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">
+                  <v:shape id="Picture 48" o:spid="_x0000_s1038" type="#_x0000_t75" alt="CRNRC057" style="position:absolute;left:1978;top:1425;width:1920;height:1905;rotation:-90;visibility:visible;mso-wrap-style:square" o:gfxdata="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">
+                    <v:imagedata r:id="rId14" o:title="CRNRC057"/>
                   </v:shape>
-                  <v:shape id="Picture 49" o:spid="_x0000_s1026" o:spt="75" alt="CRNRC047" type="#_x0000_t75" style="position:absolute;left:2373;top:1872;height:855;width:870;rotation:-5898240f;" filled="f" o:preferrelative="t" stroked="f" coordsize="21600,21600" o:gfxdata="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">
-                    <v:fill on="f" focussize="0,0"/>
-                    <v:stroke on="f"/>
-                    <v:imagedata r:id="rId15" o:title=""/>
-                    <o:lock v:ext="edit" aspectratio="t"/>
+                  <v:shape id="Picture 49" o:spid="_x0000_s1039" type="#_x0000_t75" alt="CRNRC047" style="position:absolute;left:2373;top:1872;width:870;height:855;rotation:-90;visibility:visible;mso-wrap-style:square" o:gfxdata="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">
+                    <v:imagedata r:id="rId15" o:title="CRNRC047"/>
                   </v:shape>
                 </v:group>
-                <v:shape id="Picture 50" o:spid="_x0000_s1026" o:spt="75" alt="BDRSC012" type="#_x0000_t75" style="position:absolute;left:10525;top:3323;height:10339;width:140;" filled="f" o:preferrelative="t" stroked="f" coordsize="21600,21600" o:gfxdata="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">
-                  <v:fill on="f" focussize="0,0"/>
-                  <v:stroke on="f"/>
-                  <v:imagedata r:id="rId18" gain="126030f" blacklevel="1966f" o:title=""/>
-                  <o:lock v:ext="edit" aspectratio="t"/>
+                <v:shape id="Picture 50" o:spid="_x0000_s1040" type="#_x0000_t75" alt="BDRSC012" style="position:absolute;left:10525;top:3323;width:140;height:10339;visibility:visible;mso-wrap-style:square" o:gfxdata="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">
+                  <v:imagedata r:id="rId18" o:title="BDRSC012" gain="126031f" blacklevel="1966f"/>
                 </v:shape>
-                <v:shape id="Picture 51" o:spid="_x0000_s1026" o:spt="75" alt="BDRSC012" type="#_x0000_t75" style="position:absolute;left:2125;top:3323;height:10339;width:140;" fillcolor="#33CCCC" filled="t" o:preferrelative="t" stroked="f" coordsize="21600,21600" o:gfxdata="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">
-                  <v:fill on="t" focussize="0,0"/>
-                  <v:stroke on="f"/>
-                  <v:imagedata r:id="rId18" o:title=""/>
-                  <o:lock v:ext="edit" aspectratio="t"/>
+                <v:shape id="Picture 51" o:spid="_x0000_s1041" type="#_x0000_t75" alt="BDRSC012" style="position:absolute;left:2125;top:3323;width:140;height:10339;visibility:visible;mso-wrap-style:square" o:gfxdata="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" filled="t" fillcolor="#3cc">
+                  <v:imagedata r:id="rId18" o:title="BDRSC012"/>
                 </v:shape>
-                <v:shape id="Picture 52" o:spid="_x0000_s1026" o:spt="75" alt="J0105250" type="#_x0000_t75" style="position:absolute;left:3940;top:15149;height:194;width:4860;" filled="f" o:preferrelative="t" stroked="f" coordsize="21600,21600" o:gfxdata="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">
-                  <v:fill on="f" focussize="0,0"/>
-                  <v:stroke on="f"/>
-                  <v:imagedata r:id="rId16" o:title=""/>
-                  <o:lock v:ext="edit" aspectratio="t"/>
+                <v:shape id="Picture 52" o:spid="_x0000_s1042" type="#_x0000_t75" alt="J0105250" style="position:absolute;left:3940;top:15149;width:4860;height:194;visibility:visible;mso-wrap-style:square" o:gfxdata="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">
+                  <v:imagedata r:id="rId16" o:title="J0105250"/>
                 </v:shape>
+                <w10:wrap anchorx="margin" anchory="margin"/>
               </v:group>
             </w:pict>
           </mc:Fallback>
@@ -1824,94 +1803,54 @@
               </wp:anchor>
             </w:drawing>
           </mc:Choice>
-          <mc:Fallback xmlns:wpsCustomData="http://www.wps.cn/officeDocument/2013/wpsCustomData">
+          <mc:Fallback>
             <w:pict>
-              <v:group id="Nhóm 461" o:spid="_x0000_s1026" o:spt="203" style="position:absolute;left:0pt;height:770.85pt;width:501.9pt;mso-position-horizontal:center;mso-position-horizontal-relative:margin;mso-position-vertical:center;mso-position-vertical-relative:margin;z-index:-251656192;mso-width-relative:page;mso-height-relative:page;" coordorigin="1985,1418" coordsize="8820,14097" o:gfxdata="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">
-                <o:lock v:ext="edit" aspectratio="f"/>
-                <v:group id="Group 37" o:spid="_x0000_s1026" o:spt="203" style="position:absolute;left:1985;top:1418;height:1920;width:1905;" coordorigin="1985,1418" coordsize="1905,1920" o:gfxdata="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">
-                  <o:lock v:ext="edit" aspectratio="f"/>
-                  <v:shape id="Picture 38" o:spid="_x0000_s1026" o:spt="75" alt="CRNRC057" type="#_x0000_t75" style="position:absolute;left:1978;top:1425;height:1905;width:1920;rotation:-5898240f;" filled="f" o:preferrelative="t" stroked="f" coordsize="21600,21600" o:gfxdata="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">
-                    <v:fill on="f" focussize="0,0"/>
-                    <v:stroke on="f"/>
-                    <v:imagedata r:id="rId14" o:title=""/>
-                    <o:lock v:ext="edit" aspectratio="t"/>
+              <v:group w14:anchorId="32158496" id="Nhóm 461" o:spid="_x0000_s1026" style="position:absolute;margin-left:0;margin-top:0;width:501.9pt;height:770.85pt;z-index:-251656192;mso-position-horizontal:center;mso-position-horizontal-relative:margin;mso-position-vertical:center;mso-position-vertical-relative:margin" coordorigin="1985,1418" coordsize="8820,14097" o:gfxdata="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">
+                <v:group id="Group 37" o:spid="_x0000_s1027" style="position:absolute;left:1985;top:1418;width:1905;height:1920" coordorigin="1985,1418" coordsize="1905,1920" o:gfxdata="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">
+                  <v:shape id="Picture 38" o:spid="_x0000_s1028" type="#_x0000_t75" alt="CRNRC057" style="position:absolute;left:1978;top:1425;width:1920;height:1905;rotation:-90;visibility:visible;mso-wrap-style:square" o:gfxdata="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">
+                    <v:imagedata r:id="rId14" o:title="CRNRC057"/>
                   </v:shape>
-                  <v:shape id="Picture 39" o:spid="_x0000_s1026" o:spt="75" alt="CRNRC047" type="#_x0000_t75" style="position:absolute;left:2373;top:1872;height:855;width:870;rotation:-5898240f;" filled="f" o:preferrelative="t" stroked="f" coordsize="21600,21600" o:gfxdata="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">
-                    <v:fill on="f" focussize="0,0"/>
-                    <v:stroke on="f"/>
-                    <v:imagedata r:id="rId15" o:title=""/>
-                    <o:lock v:ext="edit" aspectratio="t"/>
+                  <v:shape id="Picture 39" o:spid="_x0000_s1029" type="#_x0000_t75" alt="CRNRC047" style="position:absolute;left:2373;top:1872;width:870;height:855;rotation:-90;visibility:visible;mso-wrap-style:square" o:gfxdata="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">
+                    <v:imagedata r:id="rId15" o:title="CRNRC047"/>
                   </v:shape>
                 </v:group>
-                <v:shape id="Picture 40" o:spid="_x0000_s1026" o:spt="75" alt="J0105250" type="#_x0000_t75" style="position:absolute;left:3865;top:1544;height:194;width:4860;" filled="f" o:preferrelative="t" stroked="f" coordsize="21600,21600" o:gfxdata="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">
-                  <v:fill on="f" focussize="0,0"/>
-                  <v:stroke on="f"/>
-                  <v:imagedata r:id="rId16" o:title=""/>
-                  <o:lock v:ext="edit" aspectratio="t"/>
+                <v:shape id="Picture 40" o:spid="_x0000_s1030" type="#_x0000_t75" alt="J0105250" style="position:absolute;left:3865;top:1544;width:4860;height:194;visibility:visible;mso-wrap-style:square" o:gfxdata="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">
+                  <v:imagedata r:id="rId16" o:title="J0105250"/>
                 </v:shape>
-                <v:group id="Group 41" o:spid="_x0000_s1026" o:spt="203" style="position:absolute;left:8892;top:1418;height:1920;width:1905;rotation:5898240f;" coordorigin="1985,1418" coordsize="1905,1920" o:gfxdata="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">
-                  <o:lock v:ext="edit" aspectratio="f"/>
-                  <v:shape id="Picture 42" o:spid="_x0000_s1026" o:spt="75" alt="CRNRC057" type="#_x0000_t75" style="position:absolute;left:1978;top:1425;height:1905;width:1920;rotation:-5898240f;" filled="f" o:preferrelative="t" stroked="f" coordsize="21600,21600" o:gfxdata="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">
-                    <v:fill on="f" focussize="0,0"/>
-                    <v:stroke on="f"/>
-                    <v:imagedata r:id="rId17" o:title=""/>
-                    <o:lock v:ext="edit" aspectratio="t"/>
+                <v:group id="Group 41" o:spid="_x0000_s1031" style="position:absolute;left:8892;top:1418;width:1905;height:1920;rotation:90" coordorigin="1985,1418" coordsize="1905,1920" o:gfxdata="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">
+                  <v:shape id="Picture 42" o:spid="_x0000_s1032" type="#_x0000_t75" alt="CRNRC057" style="position:absolute;left:1978;top:1425;width:1920;height:1905;rotation:-90;visibility:visible;mso-wrap-style:square" o:gfxdata="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">
+                    <v:imagedata r:id="rId17" o:title="CRNRC057"/>
                   </v:shape>
-                  <v:shape id="Picture 43" o:spid="_x0000_s1026" o:spt="75" alt="CRNRC047" type="#_x0000_t75" style="position:absolute;left:2373;top:1872;height:855;width:870;rotation:-5898240f;" filled="f" o:preferrelative="t" stroked="f" coordsize="21600,21600" o:gfxdata="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">
-                    <v:fill on="f" focussize="0,0"/>
-                    <v:stroke on="f"/>
-                    <v:imagedata r:id="rId15" o:title=""/>
-                    <o:lock v:ext="edit" aspectratio="t"/>
+                  <v:shape id="Picture 43" o:spid="_x0000_s1033" type="#_x0000_t75" alt="CRNRC047" style="position:absolute;left:2373;top:1872;width:870;height:855;rotation:-90;visibility:visible;mso-wrap-style:square" o:gfxdata="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">
+                    <v:imagedata r:id="rId15" o:title="CRNRC047"/>
                   </v:shape>
                 </v:group>
-                <v:group id="Group 44" o:spid="_x0000_s1026" o:spt="203" style="position:absolute;left:1992;top:13595;height:1920;width:1905;rotation:-5898240f;" coordorigin="1985,1418" coordsize="1905,1920" o:gfxdata="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">
-                  <o:lock v:ext="edit" aspectratio="f"/>
-                  <v:shape id="Picture 45" o:spid="_x0000_s1026" o:spt="75" alt="CRNRC057" type="#_x0000_t75" style="position:absolute;left:1978;top:1425;height:1905;width:1920;rotation:-5898240f;" filled="f" o:preferrelative="t" stroked="f" coordsize="21600,21600" o:gfxdata="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">
-                    <v:fill on="f" focussize="0,0"/>
-                    <v:stroke on="f"/>
-                    <v:imagedata r:id="rId17" o:title=""/>
-                    <o:lock v:ext="edit" aspectratio="t"/>
+                <v:group id="Group 44" o:spid="_x0000_s1034" style="position:absolute;left:1992;top:13595;width:1905;height:1920;rotation:-90" coordorigin="1985,1418" coordsize="1905,1920" o:gfxdata="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">
+                  <v:shape id="Picture 45" o:spid="_x0000_s1035" type="#_x0000_t75" alt="CRNRC057" style="position:absolute;left:1978;top:1425;width:1920;height:1905;rotation:-90;visibility:visible;mso-wrap-style:square" o:gfxdata="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">
+                    <v:imagedata r:id="rId17" o:title="CRNRC057"/>
                   </v:shape>
-                  <v:shape id="Picture 46" o:spid="_x0000_s1026" o:spt="75" alt="CRNRC047" type="#_x0000_t75" style="position:absolute;left:2373;top:1872;height:855;width:870;rotation:-5898240f;" filled="f" o:preferrelative="t" stroked="f" coordsize="21600,21600" o:gfxdata="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">
-                    <v:fill on="f" focussize="0,0"/>
-                    <v:stroke on="f"/>
-                    <v:imagedata r:id="rId15" o:title=""/>
-                    <o:lock v:ext="edit" aspectratio="t"/>
+                  <v:shape id="Picture 46" o:spid="_x0000_s1036" type="#_x0000_t75" alt="CRNRC047" style="position:absolute;left:2373;top:1872;width:870;height:855;rotation:-90;visibility:visible;mso-wrap-style:square" o:gfxdata="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">
+                    <v:imagedata r:id="rId15" o:title="CRNRC047"/>
                   </v:shape>
                 </v:group>
-                <v:group id="Group 47" o:spid="_x0000_s1026" o:spt="203" style="position:absolute;left:8899;top:13595;height:1920;width:1905;rotation:11796480f;" coordorigin="1985,1418" coordsize="1905,1920" o:gfxdata="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">
-                  <o:lock v:ext="edit" aspectratio="f"/>
-                  <v:shape id="Picture 48" o:spid="_x0000_s1026" o:spt="75" alt="CRNRC057" type="#_x0000_t75" style="position:absolute;left:1978;top:1425;height:1905;width:1920;rotation:-5898240f;" filled="f" o:preferrelative="t" stroked="f" coordsize="21600,21600" o:gfxdata="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">
-                    <v:fill on="f" focussize="0,0"/>
-                    <v:stroke on="f"/>
-                    <v:imagedata r:id="rId14" o:title=""/>
-                    <o:lock v:ext="edit" aspectratio="t"/>
+                <v:group id="Group 47" o:spid="_x0000_s1037" style="position:absolute;left:8899;top:13595;width:1905;height:1920;rotation:180" coordorigin="1985,1418" coordsize="1905,1920" o:gfxdata="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">
+                  <v:shape id="Picture 48" o:spid="_x0000_s1038" type="#_x0000_t75" alt="CRNRC057" style="position:absolute;left:1978;top:1425;width:1920;height:1905;rotation:-90;visibility:visible;mso-wrap-style:square" o:gfxdata="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">
+                    <v:imagedata r:id="rId14" o:title="CRNRC057"/>
                   </v:shape>
-                  <v:shape id="Picture 49" o:spid="_x0000_s1026" o:spt="75" alt="CRNRC047" type="#_x0000_t75" style="position:absolute;left:2373;top:1872;height:855;width:870;rotation:-5898240f;" filled="f" o:preferrelative="t" stroked="f" coordsize="21600,21600" o:gfxdata="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">
-                    <v:fill on="f" focussize="0,0"/>
-                    <v:stroke on="f"/>
-                    <v:imagedata r:id="rId15" o:title=""/>
-                    <o:lock v:ext="edit" aspectratio="t"/>
+                  <v:shape id="Picture 49" o:spid="_x0000_s1039" type="#_x0000_t75" alt="CRNRC047" style="position:absolute;left:2373;top:1872;width:870;height:855;rotation:-90;visibility:visible;mso-wrap-style:square" o:gfxdata="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">
+                    <v:imagedata r:id="rId15" o:title="CRNRC047"/>
                   </v:shape>
                 </v:group>
-                <v:shape id="Picture 50" o:spid="_x0000_s1026" o:spt="75" alt="BDRSC012" type="#_x0000_t75" style="position:absolute;left:10525;top:3323;height:10339;width:140;" filled="f" o:preferrelative="t" stroked="f" coordsize="21600,21600" o:gfxdata="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">
-                  <v:fill on="f" focussize="0,0"/>
-                  <v:stroke on="f"/>
-                  <v:imagedata r:id="rId18" gain="126030f" blacklevel="1966f" o:title=""/>
-                  <o:lock v:ext="edit" aspectratio="t"/>
+                <v:shape id="Picture 50" o:spid="_x0000_s1040" type="#_x0000_t75" alt="BDRSC012" style="position:absolute;left:10525;top:3323;width:140;height:10339;visibility:visible;mso-wrap-style:square" o:gfxdata="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">
+                  <v:imagedata r:id="rId18" o:title="BDRSC012" gain="126031f" blacklevel="1966f"/>
                 </v:shape>
-                <v:shape id="Picture 51" o:spid="_x0000_s1026" o:spt="75" alt="BDRSC012" type="#_x0000_t75" style="position:absolute;left:2125;top:3323;height:10339;width:140;" fillcolor="#33CCCC" filled="t" o:preferrelative="t" stroked="f" coordsize="21600,21600" o:gfxdata="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">
-                  <v:fill on="t" focussize="0,0"/>
-                  <v:stroke on="f"/>
-                  <v:imagedata r:id="rId18" o:title=""/>
-                  <o:lock v:ext="edit" aspectratio="t"/>
+                <v:shape id="Picture 51" o:spid="_x0000_s1041" type="#_x0000_t75" alt="BDRSC012" style="position:absolute;left:2125;top:3323;width:140;height:10339;visibility:visible;mso-wrap-style:square" o:gfxdata="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" filled="t" fillcolor="#3cc">
+                  <v:imagedata r:id="rId18" o:title="BDRSC012"/>
                 </v:shape>
-                <v:shape id="Picture 52" o:spid="_x0000_s1026" o:spt="75" alt="J0105250" type="#_x0000_t75" style="position:absolute;left:3940;top:15149;height:194;width:4860;" filled="f" o:preferrelative="t" stroked="f" coordsize="21600,21600" o:gfxdata="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">
-                  <v:fill on="f" focussize="0,0"/>
-                  <v:stroke on="f"/>
-                  <v:imagedata r:id="rId16" o:title=""/>
-                  <o:lock v:ext="edit" aspectratio="t"/>
+                <v:shape id="Picture 52" o:spid="_x0000_s1042" type="#_x0000_t75" alt="J0105250" style="position:absolute;left:3940;top:15149;width:4860;height:194;visibility:visible;mso-wrap-style:square" o:gfxdata="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">
+                  <v:imagedata r:id="rId16" o:title="J0105250"/>
                 </v:shape>
+                <w10:wrap anchorx="margin" anchory="margin"/>
               </v:group>
             </w:pict>
           </mc:Fallback>
@@ -7331,98 +7270,117 @@
     <w:p>
       <w:pPr>
         <w:ind w:firstLine="426"/>
+        <w:rPr>
+          <w:lang w:val="en-GB"/>
+        </w:rPr>
       </w:pPr>
       <w:r>
-        <w:t>Hệ thống phục vụ việc quản lý, phân phối và bán vé cho các sự kiện âm nhạc trực tiếp, tập trung vào mô hình vé có chỉ định chỗ ngồi cụ thể tại các địa điểm vật lý cố định.</w:t>
+        <w:rPr>
+          <w:lang w:val="en-GB"/>
+        </w:rPr>
+        <w:t>Hệ thống phục vụ việc quản lý, phân phối và bán vé cho các sự kiện âm nhạc trực tiếp tại các địa điểm có bố trí chỗ ngồi cố định. Mỗi sự kiện có các vị trí ngồi được xác định trước và phân phối cho người mua dưới dạng vé.</w:t>
       </w:r>
       <w:r>
-        <w:t xml:space="preserve"> Đây là một miền nghiệp vụ có độ phức tạp cao, đòi hỏi tính nhất quán dữ liệu ở mức độ tuyệt đối cùng khả năng xử lý giao dịch đồng thời cực lớn tại các thời điểm mở bán cao điểm.</w:t>
+        <w:rPr>
+          <w:lang w:val="en-GB"/>
+        </w:rPr>
+        <w:t xml:space="preserve"> Vì vậy</w:t>
+      </w:r>
+      <w:r>
+        <w:rPr>
+          <w:lang w:val="en-GB"/>
+        </w:rPr>
+        <w:t>, hệ thống phải quản lý không chỉ thông tin sự kiện và đơn hàng mà còn trạng thái của từng vị trí trong quá trình mở bán, đặt vé, thanh toán và sử dụng vé.</w:t>
       </w:r>
     </w:p>
     <w:p>
       <w:pPr>
         <w:ind w:firstLine="426"/>
+        <w:rPr>
+          <w:lang w:val="en-GB"/>
+        </w:rPr>
       </w:pPr>
       <w:r>
-        <w:t xml:space="preserve">Bài toán nghiệp vụ xoay quanh việc quản lý vòng đời của các tài nguyên vật lý và tài nguyên số. Không gian sự kiện tĩnh (Venue, Zone, Seat) được số hóa và chuyển đổi thành kho vé động (EventSeat) gắn liền với từng Concert cụ thể. </w:t>
+        <w:rPr>
+          <w:lang w:val="en-GB"/>
+        </w:rPr>
+        <w:t>Đặc thù của bài toán nằm ở việc nhiều người dùng có thể đồng thời yêu cầu mua cùng một vị trí</w:t>
       </w:r>
       <w:r>
-        <w:t>Khi mở bán, hệ thống phải giải quyết ba vấn đề chính:</w:t>
+        <w:rPr>
+          <w:lang w:val="en-GB"/>
+        </w:rPr>
+        <w:t xml:space="preserve">, đặc biệt </w:t>
+      </w:r>
+      <w:r>
+        <w:t>trong thời điểm mở bán khi nhu cầu truy cập tăng đột biến</w:t>
+      </w:r>
+      <w:r>
+        <w:rPr>
+          <w:lang w:val="en-GB"/>
+        </w:rPr>
+        <w:t xml:space="preserve"> Hệ thống phải đảm bảo một vị trí không bị phân phối cho nhiều người mua, </w:t>
+      </w:r>
+      <w:r>
+        <w:t>điều phối lượng truy cập trong giới hạn phục vụ của hệ thống.</w:t>
+      </w:r>
+      <w:r>
+        <w:rPr>
+          <w:lang w:val="en-US"/>
+        </w:rPr>
+        <w:t xml:space="preserve"> </w:t>
+      </w:r>
+      <w:r>
+        <w:rPr>
+          <w:lang w:val="en-GB"/>
+        </w:rPr>
+        <w:t>Đ</w:t>
+      </w:r>
+      <w:r>
+        <w:rPr>
+          <w:lang w:val="en-GB"/>
+        </w:rPr>
+        <w:t>ồng thời</w:t>
+      </w:r>
+      <w:r>
+        <w:rPr>
+          <w:lang w:val="en-GB"/>
+        </w:rPr>
+        <w:t>, hệ thống phải</w:t>
+      </w:r>
+      <w:r>
+        <w:rPr>
+          <w:lang w:val="en-GB"/>
+        </w:rPr>
+        <w:t xml:space="preserve"> xử lý chính xác các trường hợp giữ chỗ nhưng không hoàn tất thanh toán, thanh toán thành công, thất bại hoặc được hoàn tiền.</w:t>
       </w:r>
     </w:p>
     <w:p>
       <w:pPr>
-        <w:numPr>
-          <w:ilvl w:val="0"/>
-          <w:numId w:val="15"/>
-        </w:numPr>
+        <w:ind w:firstLine="426"/>
+        <w:rPr>
+          <w:lang w:val="en-GB"/>
+        </w:rPr>
       </w:pPr>
       <w:r>
         <w:rPr>
-          <w:b/>
-          <w:bCs/>
-        </w:rPr>
-        <w:t>Chống bán trùng ghế:</w:t>
-      </w:r>
-      <w:r>
-        <w:t xml:space="preserve"> </w:t>
-      </w:r>
-      <w:r>
-        <w:t>Đảm bảo tại một thời điểm, một vị trí ghế vật lý của một Concert chỉ được giữ hoặc sở hữu bởi tối đa một khách hàng</w:t>
-      </w:r>
-      <w:r>
-        <w:t xml:space="preserve">. </w:t>
-      </w:r>
-      <w:r>
-        <w:t>Hệ thống giải quyết bằng cơ chế khóa giữ chỗ tạm thời với thời gian hết hạn cố định</w:t>
-      </w:r>
-      <w:r>
-        <w:t>.</w:t>
+          <w:lang w:val="en-GB"/>
+        </w:rPr>
+        <w:t>Hệ thống cũng phải quản lý vòng đời giao dịch từ khi người dùng lựa chọn vị trí, giữ chỗ tạm thời, thanh toán, nhận vé đến khi vé được sử dụng. Các thông tin về đơn hàng, thanh toán, hoàn tiền, khuyến mãi và kiểm soát vé cần được ghi nhận để phục vụ kiểm tra và đối soát.</w:t>
       </w:r>
     </w:p>
     <w:p>
       <w:pPr>
-        <w:numPr>
-          <w:ilvl w:val="0"/>
-          <w:numId w:val="15"/>
-        </w:numPr>
+        <w:ind w:firstLine="426"/>
+        <w:rPr>
+          <w:lang w:val="en-GB"/>
+        </w:rPr>
       </w:pPr>
       <w:r>
         <w:rPr>
-          <w:b/>
-          <w:bCs/>
-        </w:rPr>
-        <w:t>Điều phối truy cập:</w:t>
-      </w:r>
-      <w:r>
-        <w:t xml:space="preserve"> </w:t>
-      </w:r>
-      <w:r>
-        <w:t>Khi nhu cầu mua vượt quá khả năng đáp ứng tức thời của hệ thống, luồng xếp hàng ảo và danh sách chờ được kích hoạt để kiểm soát lưu lượng và phân bổ cơ hội mua vé một cách minh bạch, chống lại các hành vi đầu cơ hoặc bot spam</w:t>
-      </w:r>
-      <w:r>
-        <w:t>.</w:t>
-      </w:r>
-    </w:p>
-    <w:p>
-      <w:pPr>
-        <w:numPr>
-          <w:ilvl w:val="0"/>
-          <w:numId w:val="15"/>
-        </w:numPr>
-      </w:pPr>
-      <w:r>
-        <w:rPr>
-          <w:b/>
-          <w:bCs/>
-        </w:rPr>
-        <w:t>Toàn vẹn tài chính và kiểm toán:</w:t>
-      </w:r>
-      <w:r>
-        <w:t xml:space="preserve"> </w:t>
-      </w:r>
-      <w:r>
-        <w:t>Mọi giao dịch tài chính liên quan đến Đặt vé, Thanh toán, Hoàn tiền và Phát hành vé đều được xử lý bằng các giao dịch toàn vẹn có cơ chế kiểm soát tranh chấp đồng thời cao. Để đảm bảo an toàn tài chính tuyệt đối trước các lỗi mạng hoặc phản hồi trễ từ cổng thanh toán, hệ thống tách biệt rạch ròi giữa 'sự thật tài chính' (tiền thực tế đã thu) và 'hiệu lực giữ chỗ'. Nếu giao dịch thanh toán được xác nhận thành công sau khi lượt giữ chỗ tạm thời đã hết hạn, hoặc nếu xảy ra nhiều giao dịch thanh toán thành công đồng thời cho cùng một đơn hàng do tranh chấp, hệ thống vẫn ghi nhận trung thực mọi khoản tiền đã thu làm căn cứ đối soát, nhưng chỉ công nhận hiệu lực đối với tối đa một giao dịch để bảo toàn kho ghế; các khoản thanh toán thừa hoặc quá hạn sẽ tự động kích hoạt tiến trình hoàn tiền không đồng bộ. Hệ thống lưu vết kiểm toán phục vụ đối soát và báo cáo doanh thu thuần.</w:t>
+          <w:lang w:val="en-GB"/>
+        </w:rPr>
+        <w:t>Do đó, bài toán có thể được chia thành ba nhóm nghiệp vụ chính: quản lý cấu trúc và sự kiện, phân phối và bán vé, và quản lý vòng đời giao dịch và vé. Trong đó, đảm bảo trạng thái chỗ ngồi chính xác khi có nhiều giao dịch đồng thời là yêu cầu nghiệp vụ trọng yếu của hệ thống.</w:t>
       </w:r>
     </w:p>
     <w:p>
@@ -7446,7 +7404,13 @@
         <w:ind w:firstLine="426"/>
       </w:pPr>
       <w:r>
-        <w:t>Hệ thống quản lý và phân phối vé concert trên SQL Server hỗ trợ mười mốt nhóm hoạt động nghiệp vụ</w:t>
+        <w:t>Phạm vi nghiệp vụ của hệ thống gồm các nhóm hoạt động</w:t>
+      </w:r>
+      <w:r>
+        <w:rPr>
+          <w:lang w:val="en-US"/>
+        </w:rPr>
+        <w:t xml:space="preserve"> sau đây</w:t>
       </w:r>
       <w:r>
         <w:t>:</w:t>
@@ -7522,6 +7486,7 @@
               <w:rPr>
                 <w:b/>
                 <w:bCs/>
+                <w:lang w:val="en-US"/>
               </w:rPr>
             </w:pPr>
             <w:r>
@@ -7529,7 +7494,15 @@
                 <w:b/>
                 <w:bCs/>
               </w:rPr>
-              <w:t>Mô tả đặc tả kỹ thuật và ràng buộc dữ liệu tại hệ thống</w:t>
+              <w:t xml:space="preserve">Mô tả </w:t>
+            </w:r>
+            <w:r>
+              <w:rPr>
+                <w:b/>
+                <w:bCs/>
+                <w:lang w:val="en-US"/>
+              </w:rPr>
+              <w:t>nghiệp vụ</w:t>
             </w:r>
           </w:p>
         </w:tc>
@@ -7546,7 +7519,6 @@
               <w:jc w:val="left"/>
             </w:pPr>
             <w:r>
-              <w:lastRenderedPageBreak/>
               <w:t>1</w:t>
             </w:r>
           </w:p>
@@ -7580,87 +7552,20 @@
               <w:rPr>
                 <w:bCs/>
               </w:rPr>
-              <w:t xml:space="preserve">Quản lý cấu trúc vật lý phân cấp của địa điểm tổ chức </w:t>
-            </w:r>
-            <w:r>
-              <w:rPr>
-                <w:bCs/>
-              </w:rPr>
-              <w:t>sự kiện</w:t>
-            </w:r>
-            <w:r>
-              <w:rPr>
-                <w:bCs/>
-              </w:rPr>
-              <w:t>: V</w:t>
-            </w:r>
-            <w:r>
-              <w:rPr>
-                <w:bCs/>
-              </w:rPr>
-              <w:t>enue</w:t>
-            </w:r>
-            <w:r>
-              <w:rPr>
-                <w:bCs/>
-              </w:rPr>
-              <w:t xml:space="preserve"> </w:t>
-            </w:r>
-            <w:r>
-              <w:rPr>
-                <w:rFonts w:cs="Times New Roman"/>
-                <w:bCs/>
-              </w:rPr>
-              <w:t>→</w:t>
-            </w:r>
-            <w:r>
-              <w:rPr>
-                <w:bCs/>
-              </w:rPr>
-              <w:t xml:space="preserve"> </w:t>
-            </w:r>
-            <w:r>
-              <w:rPr>
-                <w:bCs/>
-              </w:rPr>
-              <w:t>Z</w:t>
-            </w:r>
-            <w:r>
-              <w:rPr>
-                <w:bCs/>
-              </w:rPr>
-              <w:t xml:space="preserve">one </w:t>
-            </w:r>
-            <w:r>
-              <w:rPr>
-                <w:rFonts w:cs="Times New Roman"/>
-                <w:bCs/>
-              </w:rPr>
-              <w:t>→</w:t>
-            </w:r>
-            <w:r>
-              <w:rPr>
-                <w:bCs/>
-              </w:rPr>
-              <w:t xml:space="preserve"> </w:t>
-            </w:r>
-            <w:r>
-              <w:rPr>
-                <w:bCs/>
-              </w:rPr>
-              <w:t>S</w:t>
-            </w:r>
-            <w:r>
-              <w:rPr>
-                <w:bCs/>
-              </w:rPr>
-              <w:t>eat.</w:t>
-            </w:r>
-            <w:r>
-              <w:rPr>
-                <w:bCs/>
-              </w:rPr>
-              <w:t xml:space="preserve"> Mỗi Seat thuộc một Zone và mỗi Zone thuộc một Venue.</w:t>
+              <w:t>Quản lý cấu trúc chỗ ngồi của địa điểm, bao gồm địa điểm tổ chức, khu vực và các vị trí ngồi</w:t>
+            </w:r>
+            <w:r>
+              <w:rPr>
+                <w:bCs/>
+                <w:lang w:val="en-US"/>
+              </w:rPr>
+              <w:t xml:space="preserve"> thuộc từng khu vực</w:t>
+            </w:r>
+            <w:r>
+              <w:rPr>
+                <w:bCs/>
+              </w:rPr>
+              <w:t>.</w:t>
             </w:r>
           </w:p>
         </w:tc>
@@ -7713,7 +7618,7 @@
               <w:rPr>
                 <w:bCs/>
               </w:rPr>
-              <w:t>Quản lý thông tin và trạng thái của từng Concert, bao gồm Artist, Venue, thời gian tổ chức và lịch mở bán.</w:t>
+              <w:t>Quản lý thông tin và trạng thái của từng sự kiện, bao gồm nghệ sĩ, địa điểm, thời gian tổ chức và lịch mở bán.</w:t>
             </w:r>
           </w:p>
         </w:tc>
@@ -7745,7 +7650,7 @@
               <w:jc w:val="left"/>
             </w:pPr>
             <w:r>
-              <w:t>Quản lý kho vé</w:t>
+              <w:t>Quản lý vé</w:t>
             </w:r>
           </w:p>
         </w:tc>
@@ -7763,7 +7668,7 @@
               <w:rPr>
                 <w:bCs/>
               </w:rPr>
-              <w:t>Quản lý việc phân bổ các Seat vào kho vé của từng Concert. Giá vé được quản lý theo từng hạng vé và được áp dụng cho các vị trí Seat tương ứng trong kho vé của Concert.</w:t>
+              <w:t>Quản lý việc phân bổ các vị trí ngồi cho từng sự kiện và áp dụng hạng vé, giá vé tương ứng.</w:t>
             </w:r>
           </w:p>
         </w:tc>
@@ -7816,7 +7721,7 @@
               <w:rPr>
                 <w:bCs/>
               </w:rPr>
-              <w:t>Hỗ trợ Customer chọn ghế, giữ chỗ và thanh toán trực tuyến. Mỗi ghế chỉ được giữ chỗ hoặc mua bởi tối đa một Customer tại một thời điểm. Temporary Hold có thời hạn; khi hết hạn mà chưa thanh toán, ghế được giải phóng. Khi thanh toán thành công, Booking được xác nhận và Ticket điện tử được phát hành với mã QR định danh duy nhất.</w:t>
+              <w:t>Cho phép khách hàng lựa chọn vị trí, giữ chỗ tạm thời và thanh toán. Một vị trí chỉ được phân phối cho tối đa một khách hàng tại một thời điểm.</w:t>
             </w:r>
           </w:p>
         </w:tc>
@@ -7848,7 +7753,7 @@
               <w:jc w:val="left"/>
             </w:pPr>
             <w:r>
-              <w:t>Kiểm soát truy cập trong giai đoạn nhu cầu cao</w:t>
+              <w:t>Điều phối truy cập trong giai đoạn nhu cầu cao</w:t>
             </w:r>
           </w:p>
         </w:tc>
@@ -7939,6 +7844,7 @@
               <w:jc w:val="left"/>
             </w:pPr>
             <w:r>
+              <w:lastRenderedPageBreak/>
               <w:t>6</w:t>
             </w:r>
           </w:p>
@@ -7972,7 +7878,7 @@
               <w:rPr>
                 <w:bCs/>
               </w:rPr>
-              <w:t>Xác thực Ticket điện tử bằng mã QR tại cửa sự kiện. Check-in Staff chỉ được thực hiện soát vé tại Concert được phân công. Mỗi Ticket chỉ được chuyển sang trạng thái đã sử dụng một lần; Ticket đã check-in không thể được check-in lại.</w:t>
+              <w:t>Xác thực vé điện tử tại sự kiện và đảm bảo mỗi vé chỉ được sử dụng một lần.</w:t>
             </w:r>
           </w:p>
         </w:tc>
@@ -8022,7 +7928,7 @@
               <w:rPr>
                 <w:bCs/>
               </w:rPr>
-              <w:t>Quản lý việc áp dụng chương trình khuyến mãi cho Booking. Giá trị giảm giá được xác định tại thời điểm tạo Booking và không thay đổi khi thông tin chương trình khuyến mãi được cập nhật sau đó.</w:t>
+              <w:t>Quản lý việc áp dụng chương trình khuyến mãi cho đơn đặt vé và xác định giá trị giảm tại thời điểm giao dịch.</w:t>
             </w:r>
           </w:p>
         </w:tc>
@@ -8209,33 +8115,7 @@
               <w:rPr>
                 <w:bCs/>
               </w:rPr>
-              <w:t xml:space="preserve">Quản lý định danh và phân quyền truy cập theo mô hình </w:t>
-            </w:r>
-            <w:r>
-              <w:rPr>
-                <w:b/>
-                <w:bCs/>
-              </w:rPr>
-              <w:t>RBAC</w:t>
-            </w:r>
-            <w:r>
-              <w:rPr>
-                <w:bCs/>
-              </w:rPr>
-              <w:t xml:space="preserve"> với bốn vai trò: </w:t>
-            </w:r>
-            <w:r>
-              <w:rPr>
-                <w:b/>
-                <w:bCs/>
-              </w:rPr>
-              <w:t>Admin, Organizer, Customer và Check-in Staff</w:t>
-            </w:r>
-            <w:r>
-              <w:rPr>
-                <w:bCs/>
-              </w:rPr>
-              <w:t>. Quyền thực hiện nghiệp vụ được xác định theo vai trò của người dùng.</w:t>
+              <w:t>Quản lý tài khoản và quyền thực hiện nghiệp vụ theo vai trò của người dùng.</w:t>
             </w:r>
           </w:p>
         </w:tc>
@@ -8276,96 +8156,109 @@
             <w:tcW w:w="6510" w:type="dxa"/>
             <w:vAlign w:val="center"/>
           </w:tcPr>
-          <w:p>
-            <w:pPr>
-              <w:spacing w:line="240" w:lineRule="auto"/>
-              <w:jc w:val="left"/>
-              <w:rPr>
-                <w:bCs/>
-              </w:rPr>
-            </w:pPr>
-            <w:r>
-              <w:rPr>
-                <w:bCs/>
-              </w:rPr>
-              <w:t>Cung cấp chỉ số hoạt động kinh doanh và phục vụ công tác đối soát, kiểm toán hệ thống. Chỉ số báo cáo doanh thu được tính toán theo công thức doanh thu thuần chuẩn hóa (Doanh thu thực tế bằng tổng giá trị thanh toán thành công trừ đi tổng giá trị đã hoàn tiền)</w:t>
-            </w:r>
-            <w:r>
-              <w:rPr>
-                <w:bCs/>
-              </w:rPr>
-              <w:t xml:space="preserve">. </w:t>
-            </w:r>
-            <w:r>
-              <w:rPr>
-                <w:bCs/>
-              </w:rPr>
-              <w:t xml:space="preserve">Để đảm bảo tính bất biến lịch sử và khả năng truy vết, </w:t>
-            </w:r>
-            <w:r>
-              <w:rPr>
-                <w:bCs/>
-              </w:rPr>
-              <w:lastRenderedPageBreak/>
-              <w:t>hệ thống lưu vết tự động mọi thay đổi của dữ liệu danh mục hoặc giao dịch dưới dạng cấu trúc cặp giá trị trước và sau khi thay đổi.</w:t>
-            </w:r>
-          </w:p>
-        </w:tc>
-      </w:tr>
-      <w:tr>
-        <w:tc>
-          <w:tcPr>
-            <w:tcW w:w="670" w:type="dxa"/>
-            <w:vAlign w:val="center"/>
-          </w:tcPr>
-          <w:p>
-            <w:pPr>
-              <w:spacing w:line="240" w:lineRule="auto"/>
-              <w:jc w:val="left"/>
-            </w:pPr>
-            <w:r>
-              <w:lastRenderedPageBreak/>
-              <w:t>11</w:t>
-            </w:r>
-          </w:p>
-        </w:tc>
-        <w:tc>
-          <w:tcPr>
-            <w:tcW w:w="1877" w:type="dxa"/>
-            <w:vAlign w:val="center"/>
-          </w:tcPr>
-          <w:p>
-            <w:pPr>
-              <w:spacing w:line="240" w:lineRule="auto"/>
-              <w:jc w:val="left"/>
-            </w:pPr>
-            <w:r>
-              <w:rPr>
-                <w:bCs/>
-              </w:rPr>
-              <w:t>Các tiến trình tự động của hệ thống</w:t>
-            </w:r>
-          </w:p>
-        </w:tc>
-        <w:tc>
-          <w:tcPr>
-            <w:tcW w:w="6510" w:type="dxa"/>
-            <w:vAlign w:val="center"/>
-          </w:tcPr>
-          <w:p>
-            <w:pPr>
-              <w:spacing w:line="240" w:lineRule="auto"/>
-              <w:jc w:val="left"/>
-              <w:rPr>
-                <w:bCs/>
-              </w:rPr>
-            </w:pPr>
-            <w:r>
-              <w:rPr>
-                <w:bCs/>
-              </w:rPr>
-              <w:t>Thực hiện các tác vụ tự động theo lịch hoặc theo sự kiện nghiệp vụ, bao gồm: mở/đóng bán vé theo lịch cấu hình, giải phóng ghế khi Temporary Hold hết hạn, xử lý Waitlist khi có vé khả dụng và khởi tạo hoàn tiền khi Concert bị hủy.</w:t>
-            </w:r>
+          <w:tbl>
+            <w:tblPr>
+              <w:tblW w:w="0" w:type="auto"/>
+              <w:tblCellSpacing w:w="15" w:type="dxa"/>
+              <w:tblCellMar>
+                <w:top w:w="15" w:type="dxa"/>
+                <w:left w:w="15" w:type="dxa"/>
+                <w:bottom w:w="15" w:type="dxa"/>
+                <w:right w:w="15" w:type="dxa"/>
+              </w:tblCellMar>
+              <w:tblLook w:val="04A0" w:firstRow="1" w:lastRow="0" w:firstColumn="1" w:lastColumn="0" w:noHBand="0" w:noVBand="1"/>
+            </w:tblPr>
+            <w:tblGrid>
+              <w:gridCol w:w="96"/>
+            </w:tblGrid>
+            <w:tr>
+              <w:trPr>
+                <w:tblCellSpacing w:w="15" w:type="dxa"/>
+              </w:trPr>
+              <w:tc>
+                <w:tcPr>
+                  <w:tcW w:w="0" w:type="auto"/>
+                  <w:vAlign w:val="center"/>
+                  <w:hideMark/>
+                </w:tcPr>
+                <w:p>
+                  <w:pPr>
+                    <w:spacing w:line="240" w:lineRule="auto"/>
+                    <w:jc w:val="left"/>
+                    <w:rPr>
+                      <w:bCs/>
+                      <w:lang w:val="en-GB"/>
+                    </w:rPr>
+                  </w:pPr>
+                </w:p>
+              </w:tc>
+            </w:tr>
+          </w:tbl>
+          <w:p>
+            <w:pPr>
+              <w:spacing w:line="240" w:lineRule="auto"/>
+              <w:jc w:val="left"/>
+              <w:rPr>
+                <w:bCs/>
+                <w:vanish/>
+                <w:lang w:val="en-GB"/>
+              </w:rPr>
+            </w:pPr>
+          </w:p>
+          <w:tbl>
+            <w:tblPr>
+              <w:tblW w:w="0" w:type="auto"/>
+              <w:tblCellSpacing w:w="15" w:type="dxa"/>
+              <w:tblCellMar>
+                <w:top w:w="15" w:type="dxa"/>
+                <w:left w:w="15" w:type="dxa"/>
+                <w:bottom w:w="15" w:type="dxa"/>
+                <w:right w:w="15" w:type="dxa"/>
+              </w:tblCellMar>
+              <w:tblLook w:val="04A0" w:firstRow="1" w:lastRow="0" w:firstColumn="1" w:lastColumn="0" w:noHBand="0" w:noVBand="1"/>
+            </w:tblPr>
+            <w:tblGrid>
+              <w:gridCol w:w="6294"/>
+            </w:tblGrid>
+            <w:tr>
+              <w:trPr>
+                <w:tblCellSpacing w:w="15" w:type="dxa"/>
+              </w:trPr>
+              <w:tc>
+                <w:tcPr>
+                  <w:tcW w:w="0" w:type="auto"/>
+                  <w:vAlign w:val="center"/>
+                  <w:hideMark/>
+                </w:tcPr>
+                <w:p>
+                  <w:pPr>
+                    <w:spacing w:line="240" w:lineRule="auto"/>
+                    <w:jc w:val="left"/>
+                    <w:rPr>
+                      <w:bCs/>
+                      <w:lang w:val="en-GB"/>
+                    </w:rPr>
+                  </w:pPr>
+                  <w:r>
+                    <w:rPr>
+                      <w:bCs/>
+                      <w:lang w:val="en-GB"/>
+                    </w:rPr>
+                    <w:t>Cung cấp thông tin phục vụ theo dõi hoạt động, đối soát và kiểm toán; lưu vết các thay đổi và giao dịch cần thiết.</w:t>
+                  </w:r>
+                </w:p>
+              </w:tc>
+            </w:tr>
+          </w:tbl>
+          <w:p>
+            <w:pPr>
+              <w:spacing w:line="240" w:lineRule="auto"/>
+              <w:jc w:val="left"/>
+              <w:rPr>
+                <w:bCs/>
+                <w:lang w:val="en-US"/>
+              </w:rPr>
+            </w:pPr>
           </w:p>
         </w:tc>
       </w:tr>
@@ -8431,7 +8324,7 @@
         <w:rPr>
           <w:bCs/>
         </w:rPr>
-        <w:t>Đây là các thực thể nằm ngoài ranh giới kỹ thuật trực tiếp của hệ thống cơ sở dữ liệu (không có tài khoản đăng nhập trực tiếp, không sở hữu sơ đồ bảng vật lý) nhưng có vai trò định hình bối cảnh nghiệp vụ và các điểm tích hợp dữ liệu:</w:t>
+        <w:t>Các bên liên quan bên ngoài là những tổ chức hoặc chủ thể không trực tiếp vận hành hệ thống nhưng có quyền lợi, trách nhiệm hoặc mối quan hệ nghiệp vụ với hoạt động quản lý và bán vé của hệ thống.</w:t>
       </w:r>
     </w:p>
     <w:p>
@@ -8465,14 +8358,7 @@
           <w:b w:val="0"/>
           <w:bCs/>
         </w:rPr>
-        <w:t>Bên sở hữu cấu trúc vật lý của địa điểm. Dữ liệu sơ đồ ghế vật lý tĩnh (Venue, Zone, Seat) phải khớp 100% với hiện trạng thực tế do ban quản lý địa điểm cung cấp trước khi đưa vào hệ thống</w:t>
-      </w:r>
-      <w:r>
-        <w:rPr>
-          <w:b w:val="0"/>
-          <w:bCs/>
-        </w:rPr>
-        <w:t>.</w:t>
+        <w:t>Cung cấp và xác nhận thông tin về địa điểm tổ chức, cấu trúc khu vực và sơ đồ chỗ ngồi thực tế. Thông tin này là cơ sở để hệ thống phân bổ và bán vé theo từng vị trí.</w:t>
       </w:r>
     </w:p>
     <w:p>
@@ -8492,7 +8378,7 @@
           <w:b w:val="0"/>
           <w:bCs/>
         </w:rPr>
-        <w:t>Nghệ sĩ biểu diễn</w:t>
+        <w:t>Đơn vị cung cấp dịch vụ thanh toán</w:t>
       </w:r>
       <w:r>
         <w:rPr>
@@ -8506,21 +8392,14 @@
           <w:b w:val="0"/>
           <w:bCs/>
         </w:rPr>
-        <w:t xml:space="preserve"> </w:t>
+        <w:t> </w:t>
       </w:r>
       <w:r>
         <w:rPr>
           <w:b w:val="0"/>
           <w:bCs/>
         </w:rPr>
-        <w:t>Chủ thể biểu diễn của concert. </w:t>
-      </w:r>
-      <w:r>
-        <w:rPr>
-          <w:b w:val="0"/>
-          <w:bCs/>
-        </w:rPr>
-        <w:t>Thông tin nghệ sĩ được quản lý tập trung ở bảng danh mục dùng chung để liên kết hiển thị cho khách hàng.</w:t>
+        <w:t>Cung cấp dịch vụ xử lý thanh toán và hoàn tiền cho các giao dịch mua vé. Kết quả xử lý từ dịch vụ thanh toán là cơ sở để xác định trạng thái thanh toán và thực hiện các nghiệp vụ tiếp theo.</w:t>
       </w:r>
     </w:p>
     <w:p>
@@ -8540,7 +8419,7 @@
           <w:b w:val="0"/>
           <w:bCs/>
         </w:rPr>
-        <w:t>Cổng thanh toán và ngân hàng</w:t>
+        <w:t>Cơ quan quản lý tài chính và thuế</w:t>
       </w:r>
       <w:r>
         <w:rPr>
@@ -8554,14 +8433,14 @@
           <w:b w:val="0"/>
           <w:bCs/>
         </w:rPr>
-        <w:t xml:space="preserve"> Chịu trách nhiệm thực thi dòng tiền thực tế. </w:t>
+        <w:t xml:space="preserve"> </w:t>
       </w:r>
       <w:r>
         <w:rPr>
           <w:b w:val="0"/>
           <w:bCs/>
         </w:rPr>
-        <w:t>Hệ thống tiếp nhận kết quả giao dịch từ các dịch vụ bên ngoài và cập nhật trạng thái Payment hoặc Refund tương ứng.</w:t>
+        <w:t>Liên quan đến việc tuân thủ các quy định và nghĩa vụ tài chính phát sinh từ hoạt động bán vé. Thông tin giao dịch, thanh toán và hoàn tiền được lưu trữ để phục vụ đối soát và kiểm tra khi cần thiết.</w:t>
       </w:r>
     </w:p>
     <w:p>
@@ -8572,70 +8451,23 @@
           <w:numId w:val="12"/>
         </w:numPr>
         <w:rPr>
+          <w:bCs/>
+        </w:rPr>
+      </w:pPr>
+      <w:r>
+        <w:rPr>
           <w:b w:val="0"/>
           <w:bCs/>
         </w:rPr>
-      </w:pPr>
+        <w:t xml:space="preserve">Nhà cung cấp dịch vụ thông báo và xác thực: Cung cấp các dịch vụ bên ngoài như gửi email, SMS hoặc hỗ trợ xác thực tài khoản. Các dịch vụ này hỗ trợ hệ thống trong việc </w:t>
+      </w:r>
       <w:r>
         <w:rPr>
           <w:b w:val="0"/>
           <w:bCs/>
         </w:rPr>
-        <w:t>Cơ quan quản lý tài chính và thuế</w:t>
-      </w:r>
-      <w:r>
-        <w:rPr>
-          <w:b w:val="0"/>
-          <w:bCs/>
-        </w:rPr>
-        <w:t>:</w:t>
-      </w:r>
-      <w:r>
-        <w:rPr>
-          <w:b w:val="0"/>
-          <w:bCs/>
-        </w:rPr>
-        <w:t xml:space="preserve"> </w:t>
-      </w:r>
-      <w:r>
-        <w:rPr>
-          <w:b w:val="0"/>
-          <w:bCs/>
-        </w:rPr>
-        <w:t>Bên thụ hưởng và giám sát nghĩa vụ tài chính. Hệ thống đảm bảo tính bất biến của dữ liệu giao dịch và lưu vết kiểm toán để phục vụ công tác đối soát thuế độc lập ở hệ thống bên ngoài.</w:t>
-      </w:r>
-    </w:p>
-    <w:p>
-      <w:pPr>
-        <w:pStyle w:val="ListParagraph"/>
-        <w:numPr>
-          <w:ilvl w:val="0"/>
-          <w:numId w:val="12"/>
-        </w:numPr>
-        <w:rPr>
-          <w:bCs/>
-        </w:rPr>
-      </w:pPr>
-      <w:r>
-        <w:rPr>
-          <w:b w:val="0"/>
-          <w:bCs/>
-        </w:rPr>
-        <w:t>Nhà cung cấp dịch vụ tích hợp (Email/SMS Providers, Identity Providers): Hỗ trợ gửi thông báo vé, mã OTP, mã QR hoặc xác thực tài khoản bên thứ ba (SSO). Dữ liệu cấu hình tích hợp nằm ở ranh giới ngoài củ</w:t>
-      </w:r>
-      <w:r>
-        <w:rPr>
-          <w:b w:val="0"/>
-          <w:bCs/>
-        </w:rPr>
-        <w:t>a DB</w:t>
-      </w:r>
-      <w:r>
-        <w:rPr>
-          <w:b w:val="0"/>
-          <w:bCs/>
-        </w:rPr>
-        <w:t>.</w:t>
+        <w:lastRenderedPageBreak/>
+        <w:t>gửi thông báo giao dịch, thông tin vé và thực hiện các bước xác thực người dùng khi cần thiết.</w:t>
       </w:r>
     </w:p>
     <w:p>
@@ -8654,8 +8486,16 @@
         <w:rPr>
           <w:b w:val="0"/>
           <w:bCs/>
-        </w:rPr>
-        <w:t>Các tác nhân con người</w:t>
+          <w:lang w:val="en-US"/>
+        </w:rPr>
+        <w:t>T</w:t>
+      </w:r>
+      <w:r>
+        <w:rPr>
+          <w:b w:val="0"/>
+          <w:bCs/>
+        </w:rPr>
+        <w:t>ác nhân con người</w:t>
       </w:r>
     </w:p>
     <w:p>
@@ -8663,7 +8503,7 @@
         <w:ind w:firstLine="426"/>
       </w:pPr>
       <w:r>
-        <w:t>Hệ thống quản lý định danh và phân quyền tập trung dựa trên vai trò (RBAC) thông qua 4 tác nhân con người có quyền tương tác trực tiếp với cơ sở dữ liệu:</w:t>
+        <w:t>Hệ thống quản lý tài khoản và phân quyền dựa trên vai trò (RBAC), với bốn tác nhân con người được phép tương tác trực tiếp với hệ thống theo phạm vi quyền được phân công.</w:t>
       </w:r>
     </w:p>
     <w:tbl>
@@ -8737,6 +8577,7 @@
               <w:rPr>
                 <w:b/>
                 <w:bCs/>
+                <w:lang w:val="en-US"/>
               </w:rPr>
             </w:pPr>
             <w:r>
@@ -8744,14 +8585,15 @@
                 <w:b/>
                 <w:bCs/>
               </w:rPr>
-              <w:t>Phạm vi kiểm soát</w:t>
+              <w:t xml:space="preserve">Phạm vi </w:t>
             </w:r>
             <w:r>
               <w:rPr>
                 <w:b/>
                 <w:bCs/>
-              </w:rPr>
-              <w:t xml:space="preserve"> dữ liệu</w:t>
+                <w:lang w:val="en-US"/>
+              </w:rPr>
+              <w:t>quyền</w:t>
             </w:r>
           </w:p>
         </w:tc>
@@ -8767,21 +8609,16 @@
               <w:rPr>
                 <w:b/>
                 <w:bCs/>
+                <w:lang w:val="en-US"/>
               </w:rPr>
             </w:pPr>
             <w:r>
               <w:rPr>
                 <w:b/>
                 <w:bCs/>
-              </w:rPr>
-              <w:t>Quyền thao tác</w:t>
-            </w:r>
-            <w:r>
-              <w:rPr>
-                <w:b/>
-                <w:bCs/>
-              </w:rPr>
-              <w:t xml:space="preserve"> và nghiệp vụ hỗ trợ</w:t>
+                <w:lang w:val="en-US"/>
+              </w:rPr>
+              <w:t>Nghiệp vụ chính</w:t>
             </w:r>
           </w:p>
         </w:tc>
@@ -8828,20 +8665,7 @@
               <w:jc w:val="left"/>
             </w:pPr>
             <w:r>
-              <w:t>Toàn hệ thống</w:t>
-            </w:r>
-            <w:r>
-              <w:t>:</w:t>
-            </w:r>
-            <w:r>
-              <w:t xml:space="preserve"> Không bị giới hạn bởi phạm vi sở hữu của Organizer hay phân công công việc. Có quyền thao tác trên mọi dữ liệu của </w:t>
-            </w:r>
-            <w:r>
-              <w:lastRenderedPageBreak/>
-              <w:t>toàn bộ các Concert, Venue và User Account</w:t>
-            </w:r>
-            <w:r>
-              <w:t>.</w:t>
+              <w:t>Toàn hệ thống: được truy cập và quản lý dữ liệu thuộc toàn bộ sự kiện, địa điểm và tài khoản người dùng.</w:t>
             </w:r>
           </w:p>
         </w:tc>
@@ -8868,7 +8692,6 @@
               <w:rPr>
                 <w:b w:val="0"/>
               </w:rPr>
-              <w:lastRenderedPageBreak/>
               <w:t xml:space="preserve">Quản trị </w:t>
             </w:r>
             <w:r>
@@ -8886,8 +8709,15 @@
             <w:r>
               <w:rPr>
                 <w:b w:val="0"/>
-              </w:rPr>
-              <w:t>Tạo mới, khóa/mở khóa tài khoản người dùng, gán và thu hồi Role.</w:t>
+                <w:lang w:val="en-US"/>
+              </w:rPr>
+              <w:t>t</w:t>
+            </w:r>
+            <w:r>
+              <w:rPr>
+                <w:b w:val="0"/>
+              </w:rPr>
+              <w:t>ạo mới, khóa/mở khóa tài khoản người dùng, gán và thu hồi Role.</w:t>
             </w:r>
           </w:p>
           <w:p>
@@ -8911,19 +8741,38 @@
               <w:rPr>
                 <w:b w:val="0"/>
               </w:rPr>
-              <w:t xml:space="preserve"> tài nguyên tĩnh:</w:t>
+              <w:t xml:space="preserve"> </w:t>
             </w:r>
             <w:r>
               <w:rPr>
                 <w:b w:val="0"/>
               </w:rPr>
+              <w:t>đ</w:t>
+            </w:r>
+            <w:r>
+              <w:rPr>
+                <w:b w:val="0"/>
+                <w:lang w:val="en-US"/>
+              </w:rPr>
+              <w:t>ịa điểm</w:t>
+            </w:r>
+            <w:r>
+              <w:rPr>
+                <w:b w:val="0"/>
+              </w:rPr>
+              <w:t>:</w:t>
+            </w:r>
+            <w:r>
+              <w:rPr>
+                <w:b w:val="0"/>
+              </w:rPr>
               <w:t> </w:t>
             </w:r>
             <w:r>
               <w:rPr>
                 <w:b w:val="0"/>
               </w:rPr>
-              <w:t>Tạo, cập nhật thông tin Venue, Zone, Seat vật lý (đặc quyền duy nhất)</w:t>
+              <w:t>tạo và cập nhật địa điểm, khu vực và vị trí ngồi.</w:t>
             </w:r>
           </w:p>
           <w:p>
@@ -8941,26 +8790,39 @@
               <w:rPr>
                 <w:b w:val="0"/>
               </w:rPr>
-              <w:lastRenderedPageBreak/>
-              <w:t xml:space="preserve">Quyền </w:t>
+              <w:t>Qu</w:t>
             </w:r>
             <w:r>
               <w:rPr>
                 <w:b w:val="0"/>
               </w:rPr>
-              <w:t>override</w:t>
+              <w:t>ản tr</w:t>
             </w:r>
             <w:r>
               <w:rPr>
                 <w:b w:val="0"/>
+                <w:lang w:val="en-US"/>
+              </w:rPr>
+              <w:t>ị đặc biệt</w:t>
+            </w:r>
+            <w:r>
+              <w:rPr>
+                <w:b w:val="0"/>
               </w:rPr>
               <w:t>: </w:t>
             </w:r>
             <w:r>
               <w:rPr>
                 <w:b w:val="0"/>
-              </w:rPr>
-              <w:t>Thực hiện tất cả nghiệp vụ của Organizer và Check-in Staff khi cần thiết</w:t>
+                <w:lang w:val="en-US"/>
+              </w:rPr>
+              <w:t>t</w:t>
+            </w:r>
+            <w:r>
+              <w:rPr>
+                <w:b w:val="0"/>
+              </w:rPr>
+              <w:t>hực hiện tất cả nghiệp vụ của Organizer và Check-in Staff khi cần thiết</w:t>
             </w:r>
             <w:r>
               <w:rPr>
@@ -8983,32 +8845,21 @@
             <w:r>
               <w:rPr>
                 <w:b w:val="0"/>
-              </w:rPr>
-              <w:t>Quyền g</w:t>
+                <w:lang w:val="en-US"/>
+              </w:rPr>
+              <w:t>Giám sát</w:t>
             </w:r>
             <w:r>
               <w:rPr>
                 <w:b w:val="0"/>
               </w:rPr>
-              <w:t xml:space="preserve">iám sát &amp; </w:t>
+              <w:t>: </w:t>
             </w:r>
             <w:r>
               <w:rPr>
                 <w:b w:val="0"/>
               </w:rPr>
-              <w:t>t</w:t>
-            </w:r>
-            <w:r>
-              <w:rPr>
-                <w:b w:val="0"/>
-              </w:rPr>
-              <w:t>ruy vết: </w:t>
-            </w:r>
-            <w:r>
-              <w:rPr>
-                <w:b w:val="0"/>
-              </w:rPr>
-              <w:t>Truy cập toàn bộ báo cáo doanh thu và tình hình vận hành của mọi sự kiện; truy vết lịch sử giao dịch và Audit Log toàn hệ thống của tất cả các thực thể.</w:t>
+              <w:t>theo dõi báo cáo, hoạt động vận hành và lịch sử giao dịch.</w:t>
             </w:r>
           </w:p>
         </w:tc>
@@ -9025,7 +8876,6 @@
               <w:jc w:val="left"/>
             </w:pPr>
             <w:r>
-              <w:lastRenderedPageBreak/>
               <w:t>2</w:t>
             </w:r>
           </w:p>
@@ -9065,7 +8915,7 @@
               <w:t xml:space="preserve"> </w:t>
             </w:r>
             <w:r>
-              <w:t>Chỉ được phép truy cập và thao tác trên dữ liệu, giao dịch, cấu hình và báo cáo của các Concert do tài khoản của mình sở hữu.</w:t>
+              <w:t>Chỉ được truy cập và thao tác trên các sự kiện do tài khoản của mình quản lý.</w:t>
             </w:r>
           </w:p>
         </w:tc>
@@ -9089,7 +8939,20 @@
               <w:rPr>
                 <w:b w:val="0"/>
               </w:rPr>
-              <w:t>Quản lý sự kiện: tạo mới, cập nhật thông tin, lịch trình, hoặc hủy Concert.</w:t>
+              <w:t xml:space="preserve">Quản lý sự kiện: tạo mới, cập nhật thông tin, lịch trình, hoặc hủy </w:t>
+            </w:r>
+            <w:r>
+              <w:rPr>
+                <w:b w:val="0"/>
+                <w:lang w:val="en-US"/>
+              </w:rPr>
+              <w:t>sự kiện</w:t>
+            </w:r>
+            <w:r>
+              <w:rPr>
+                <w:b w:val="0"/>
+              </w:rPr>
+              <w:t>.</w:t>
             </w:r>
           </w:p>
           <w:p>
@@ -9107,7 +8970,33 @@
               <w:rPr>
                 <w:b w:val="0"/>
               </w:rPr>
-              <w:t>Cấu hình kho vé: thiết lập khu vực mở bán, hạng vé, chốt giá, định thời điểm tự động mở/đóng cửa sổ bán.</w:t>
+              <w:t xml:space="preserve">Cấu hình </w:t>
+            </w:r>
+            <w:r>
+              <w:rPr>
+                <w:b w:val="0"/>
+                <w:lang w:val="en-US"/>
+              </w:rPr>
+              <w:t>bán</w:t>
+            </w:r>
+            <w:r>
+              <w:rPr>
+                <w:b w:val="0"/>
+              </w:rPr>
+              <w:t xml:space="preserve"> vé: thiết lập khu vực mở bán, hạng vé, </w:t>
+            </w:r>
+            <w:r>
+              <w:rPr>
+                <w:b w:val="0"/>
+                <w:lang w:val="en-US"/>
+              </w:rPr>
+              <w:t>giá vé</w:t>
+            </w:r>
+            <w:r>
+              <w:rPr>
+                <w:b w:val="0"/>
+              </w:rPr>
+              <w:t>, thời điểm mở/đóng bán.</w:t>
             </w:r>
           </w:p>
           <w:p>
@@ -9126,25 +9015,25 @@
                 <w:b w:val="0"/>
                 <w:bCs/>
               </w:rPr>
-              <w:t>Cấu hình bán hàng và khuyến mãi</w:t>
+              <w:t>Cấu hình khuyến mãi</w:t>
             </w:r>
             <w:r>
               <w:rPr>
                 <w:b w:val="0"/>
               </w:rPr>
-              <w:t>: </w:t>
+              <w:t>:</w:t>
             </w:r>
             <w:r>
               <w:rPr>
                 <w:b w:val="0"/>
               </w:rPr>
-              <w:t>Định thời gian mở/đóng bán vé, thiết lập promotion, giới hạn mã Discount Code</w:t>
+              <w:t xml:space="preserve"> </w:t>
             </w:r>
             <w:r>
               <w:rPr>
                 <w:b w:val="0"/>
               </w:rPr>
-              <w:t>.</w:t>
+              <w:t>thiết lập chương trình và mã giảm giá.</w:t>
             </w:r>
           </w:p>
           <w:p>
@@ -9161,8 +9050,9 @@
             <w:r>
               <w:rPr>
                 <w:b w:val="0"/>
-              </w:rPr>
-              <w:t>Hậu mãi &amp; vận hành</w:t>
+                <w:lang w:val="en-US"/>
+              </w:rPr>
+              <w:t>Vận hành sau bán</w:t>
             </w:r>
             <w:r>
               <w:rPr>
@@ -9174,7 +9064,7 @@
               <w:rPr>
                 <w:b w:val="0"/>
               </w:rPr>
-              <w:t>Thực hiện hủy Booking, tạo Refund, phê duyệt hoàn tiền theo hạn hủy. Phân công soát vé bằng Staff Assignment.</w:t>
+              <w:t>xử lý các nghiệp vụ hủy vé, hoàn tiền và phân công nhân viên kiểm soát vé theo quyền được cấp.</w:t>
             </w:r>
           </w:p>
         </w:tc>
@@ -9230,7 +9120,7 @@
               <w:t xml:space="preserve">: </w:t>
             </w:r>
             <w:r>
-              <w:t>Chỉ được quyền truy cập và thực hiện giao dịch trên các Booking, Payment, Ticket, Waitlist/Queue Entry do chính tài khoản của mình khởi tạo. Được phép truy vấn dữ liệu Concert công bố công khai.</w:t>
+              <w:t>Chỉ được truy cập thông tin tài khoản và các đơn đặt vé, giao dịch, vé và đăng ký hàng đợi do mình tạo; được truy cập thông tin sự kiện được công bố.</w:t>
             </w:r>
           </w:p>
         </w:tc>
@@ -9258,7 +9148,7 @@
                 <w:b w:val="0"/>
                 <w:bCs/>
               </w:rPr>
-              <w:t>Mua vé trực tuyến</w:t>
+              <w:t>Mua vé</w:t>
             </w:r>
             <w:r>
               <w:rPr>
@@ -9270,7 +9160,7 @@
               <w:rPr>
                 <w:b w:val="0"/>
               </w:rPr>
-              <w:t>Tham gia Virtual Queue, duyệt kho vé hiển thị, chọn ghế, tạo Booking giữ ghế tạm thời.</w:t>
+              <w:t>tham gia hàng đợi, xem vé, chọn vị trí và tạo đơn đặt vé.</w:t>
             </w:r>
           </w:p>
           <w:p>
@@ -9291,8 +9181,9 @@
               <w:rPr>
                 <w:b w:val="0"/>
                 <w:bCs/>
-              </w:rPr>
-              <w:t>Giao dịch tài chính</w:t>
+                <w:lang w:val="en-US"/>
+              </w:rPr>
+              <w:t>Thanh toán</w:t>
             </w:r>
             <w:r>
               <w:rPr>
@@ -9304,7 +9195,7 @@
               <w:rPr>
                 <w:b w:val="0"/>
               </w:rPr>
-              <w:t>Tạo yêu cầu thanh toán, nhận vé điện tử chứa mã QR UUID v4.</w:t>
+              <w:t>thực hiện thanh toán và nhận vé điện tử.</w:t>
             </w:r>
           </w:p>
           <w:p>
@@ -9338,13 +9229,7 @@
               <w:rPr>
                 <w:b w:val="0"/>
               </w:rPr>
-              <w:t>Chủ động hủy (abandon) Booking Pending chưa thanh toán; gửi yêu cầu hủy Ticket và hoàn tiền theo chính sách hủy. Đăng ký/hủy tham gia Waitlist khi hết vé</w:t>
-            </w:r>
-            <w:r>
-              <w:rPr>
-                <w:b w:val="0"/>
-              </w:rPr>
-              <w:t>.</w:t>
+              <w:t>hủy đơn chưa thanh toán, yêu cầu hủy vé và hoàn tiền theo chính sách; đăng ký hoặc hủy đăng ký danh sách chờ.</w:t>
             </w:r>
           </w:p>
         </w:tc>
@@ -9391,7 +9276,10 @@
               <w:jc w:val="left"/>
             </w:pPr>
             <w:r>
-              <w:t>Phạm vi phân công: Chỉ được phép truy cập dữ liệu và thực hiện check-in đối với các Concert được gán bản ghi Staff Assignment hợp lệ do Admin hoặc Organizer sở hữu Concert đó thiết lập.</w:t>
+              <w:t xml:space="preserve">Phạm vi phân công: </w:t>
+            </w:r>
+            <w:r>
+              <w:t>Chỉ được thực hiện kiểm soát vé tại các sự kiện mà mình được phân công</w:t>
             </w:r>
           </w:p>
         </w:tc>
@@ -9415,13 +9303,32 @@
               <w:rPr>
                 <w:b w:val="0"/>
               </w:rPr>
-              <w:t>Xác thực v: </w:t>
+              <w:t>Xác thực v</w:t>
             </w:r>
             <w:r>
               <w:rPr>
                 <w:b w:val="0"/>
               </w:rPr>
-              <w:t>Nhập hoặc quét mã QR chứa Ticket Code (UUID v4) của khách hàng.</w:t>
+              <w:t>é</w:t>
+            </w:r>
+            <w:r>
+              <w:rPr>
+                <w:b w:val="0"/>
+              </w:rPr>
+              <w:t>: </w:t>
+            </w:r>
+            <w:r>
+              <w:rPr>
+                <w:b w:val="0"/>
+              </w:rPr>
+              <w:t>quét hoặc nhập mã định danh vé</w:t>
+            </w:r>
+            <w:r>
+              <w:rPr>
+                <w:b w:val="0"/>
+                <w:lang w:val="en-US"/>
+              </w:rPr>
+              <w:t>.</w:t>
             </w:r>
           </w:p>
           <w:p>
@@ -9439,25 +9346,26 @@
               <w:rPr>
                 <w:b w:val="0"/>
               </w:rPr>
-              <w:t>Ghi nhận Check-in: Thực hiện thao tác cập nhật trạng thái vé (chuyển sang "Đã sử dụng")</w:t>
+              <w:t xml:space="preserve">Ghi nhận </w:t>
             </w:r>
             <w:r>
               <w:rPr>
                 <w:b w:val="0"/>
-              </w:rPr>
-              <w:t xml:space="preserve"> thành công đúng 1 lần</w:t>
+                <w:lang w:val="en-US"/>
+              </w:rPr>
+              <w:t>c</w:t>
             </w:r>
             <w:r>
               <w:rPr>
                 <w:b w:val="0"/>
               </w:rPr>
-              <w:t xml:space="preserve">, </w:t>
+              <w:t>heck-in: </w:t>
             </w:r>
             <w:r>
               <w:rPr>
                 <w:b w:val="0"/>
               </w:rPr>
-              <w:t>ghi nhận lịch sử check-in thời gian thực.</w:t>
+              <w:t>xác thực và ghi nhận vé đã được sử dụng. Mỗi vé chỉ được check-in thành công một lần.</w:t>
             </w:r>
           </w:p>
         </w:tc>
@@ -9479,20 +9387,6 @@
           <w:b w:val="0"/>
         </w:rPr>
         <w:t>Các tiến trình tự động của hệ thống</w:t>
-      </w:r>
-    </w:p>
-    <w:p>
-      <w:pPr>
-        <w:ind w:firstLine="426"/>
-        <w:rPr>
-          <w:bCs/>
-        </w:rPr>
-      </w:pPr>
-      <w:r>
-        <w:rPr>
-          <w:bCs/>
-        </w:rPr>
-        <w:t>Hệ thống có 5 tiến trình tự động, được kích hoạt định kỳ hoặc theo sự kiện nghiệp vụ. Các tiến trình được thiết kế theo nguyên tắc idempotency: chỉ thực hiện chuyển trạng thái khi trạng thái hiện tại đáp ứng điều kiện xử lý.</w:t>
       </w:r>
     </w:p>
     <w:tbl>
@@ -9517,13 +9411,15 @@
               <w:spacing w:line="240" w:lineRule="auto"/>
               <w:rPr>
                 <w:b/>
+                <w:lang w:val="en-US"/>
               </w:rPr>
             </w:pPr>
             <w:r>
               <w:rPr>
                 <w:b/>
-              </w:rPr>
-              <w:t>SIP</w:t>
+                <w:lang w:val="en-US"/>
+              </w:rPr>
+              <w:t>STT</w:t>
             </w:r>
           </w:p>
         </w:tc>
@@ -9595,14 +9491,15 @@
               <w:spacing w:line="240" w:lineRule="auto"/>
               <w:rPr>
                 <w:bCs/>
-              </w:rPr>
-            </w:pPr>
-            <w:r>
-              <w:rPr>
-                <w:bCs/>
-              </w:rPr>
-              <w:lastRenderedPageBreak/>
-              <w:t>SIP1</w:t>
+                <w:lang w:val="en-US"/>
+              </w:rPr>
+            </w:pPr>
+            <w:r>
+              <w:rPr>
+                <w:bCs/>
+                <w:lang w:val="en-US"/>
+              </w:rPr>
+              <w:t>1</w:t>
             </w:r>
           </w:p>
         </w:tc>
@@ -9640,7 +9537,7 @@
               <w:rPr>
                 <w:bCs/>
               </w:rPr>
-              <w:t>Đạt thời điểm bắt đầu hoặc kết thúc mở bán đã cấu hình.</w:t>
+              <w:t>Đến thời điểm bắt đầu/kết thúc mở bán</w:t>
             </w:r>
           </w:p>
         </w:tc>
@@ -9659,7 +9556,7 @@
               <w:rPr>
                 <w:bCs/>
               </w:rPr>
-              <w:t>Tự động chuyển trạng thái bán vé theo thời gian mở bán của Concert, bao gồm mở bán và đóng bán tại các mốc thời gian tương ứng.</w:t>
+              <w:t>Mở hoặc đóng bán vé theo lịch đã cấu hình</w:t>
             </w:r>
           </w:p>
         </w:tc>
@@ -9680,7 +9577,7 @@
               <w:rPr>
                 <w:bCs/>
               </w:rPr>
-              <w:t>SIP2</w:t>
+              <w:t>2</w:t>
             </w:r>
           </w:p>
         </w:tc>
@@ -9718,7 +9615,14 @@
               <w:rPr>
                 <w:bCs/>
               </w:rPr>
-              <w:t>Concert đang áp dụng cơ chế Fair Access và có Customer đang chờ truy cập.</w:t>
+              <w:t xml:space="preserve">Concert đang áp dụng cơ chế Fair Access và có </w:t>
+            </w:r>
+            <w:r>
+              <w:rPr>
+                <w:bCs/>
+              </w:rPr>
+              <w:lastRenderedPageBreak/>
+              <w:t>Customer đang chờ truy cập.</w:t>
             </w:r>
           </w:p>
         </w:tc>
@@ -9737,6 +9641,7 @@
               <w:rPr>
                 <w:bCs/>
               </w:rPr>
+              <w:lastRenderedPageBreak/>
               <w:t>Cấp quyền truy cập theo năng lực phục vụ của hệ thống. Quyền truy cập hết hạn nếu Customer không thực hiện đặt vé trong thời gian quy định.</w:t>
             </w:r>
           </w:p>
@@ -9758,7 +9663,7 @@
               <w:rPr>
                 <w:bCs/>
               </w:rPr>
-              <w:t>SIP3</w:t>
+              <w:t>3</w:t>
             </w:r>
           </w:p>
         </w:tc>
@@ -9790,7 +9695,7 @@
               <w:rPr>
                 <w:bCs/>
               </w:rPr>
-              <w:t>Thời hạn giữ chỗ của Booking đã hết và Booking chưa được thanh toán.</w:t>
+              <w:t>Thời hạn giữ chỗ kết thúc và đơn chưa thanh toán</w:t>
             </w:r>
           </w:p>
         </w:tc>
@@ -9830,7 +9735,7 @@
               <w:rPr>
                 <w:bCs/>
               </w:rPr>
-              <w:t>SIP4</w:t>
+              <w:t>4</w:t>
             </w:r>
           </w:p>
         </w:tc>
@@ -9868,7 +9773,7 @@
               <w:rPr>
                 <w:bCs/>
               </w:rPr>
-              <w:t>Có vé được giải phóng và có yêu cầu phù hợp trong Waitlist.</w:t>
+              <w:t>Có vị trí khả dụng và có yêu cầu phù hợp</w:t>
             </w:r>
           </w:p>
         </w:tc>
@@ -9908,7 +9813,7 @@
               <w:rPr>
                 <w:bCs/>
               </w:rPr>
-              <w:t>SIP5</w:t>
+              <w:t>5</w:t>
             </w:r>
           </w:p>
         </w:tc>
@@ -9946,7 +9851,7 @@
               <w:rPr>
                 <w:bCs/>
               </w:rPr>
-              <w:t>Concert được chuyển sang trạng thái hủy.</w:t>
+              <w:t>Sự kiện chuyển sang trạng thái hủy</w:t>
             </w:r>
           </w:p>
         </w:tc>
@@ -9982,7 +9887,7 @@
         <w:rPr>
           <w:bCs/>
         </w:rPr>
-        <w:t>Các nghiệp vụ tự động này được hệ thống ghi nhận trong Audit Log với danh tính thực hiện là tài khoản hệ thống, bảo đảm khả năng truy vết đối với các thay đổi không được thực hiện trực tiếp bởi người dùng.</w:t>
+        <w:t>Các nghiệp vụ tự động được ghi nhận trong Audit Log với chủ thể thực hiện là hệ thống, nhằm bảo đảm khả năng truy vết đối với các thay đổi không được thực hiện trực tiếp bởi người dùng.</w:t>
       </w:r>
     </w:p>
     <w:p>
@@ -10040,10 +9945,7 @@
         <w:ind w:firstLine="426"/>
       </w:pPr>
       <w:r>
-        <w:t>Các đối tượng nghiệp vụ chính của hệ thống gồm các nhóm người dùng, không gian, sự kiện, vé, giao dịch và các hoạt động liên quan đến việc phân phối và sử dụng vé. Các tác nhân con người được biểu diễn trực tiếp bằng thực thể User Account mang vai trò logic tương ứng</w:t>
-      </w:r>
-      <w:r>
-        <w:t>.</w:t>
+        <w:t>Các đối tượng nghiệp vụ chính của hệ thống bao gồm người dùng, sự kiện, nghệ sĩ, không gian tổ chức, kho vé, đặt vé, thanh toán, hoàn tiền, hàng đợi, danh sách chờ và khuyến mãi. Các tác nhân con người được định danh trong hệ thống thông qua User Account và được phân quyền theo vai trò tương ứng.</w:t>
       </w:r>
     </w:p>
     <w:tbl>
@@ -10054,8 +9956,8 @@
       </w:tblPr>
       <w:tblGrid>
         <w:gridCol w:w="1980"/>
-        <w:gridCol w:w="2410"/>
-        <w:gridCol w:w="4667"/>
+        <w:gridCol w:w="1701"/>
+        <w:gridCol w:w="5376"/>
       </w:tblGrid>
       <w:tr>
         <w:tc>
@@ -10068,8 +9970,13 @@
               <w:spacing w:line="240" w:lineRule="auto"/>
               <w:jc w:val="left"/>
               <w:rPr>
+                <w:rFonts w:eastAsia="Times New Roman" w:cs="Times New Roman"/>
                 <w:b/>
                 <w:bCs/>
+                <w:noProof w:val="0"/>
+                <w:kern w:val="0"/>
+                <w:lang w:val="en-GB" w:eastAsia="en-GB"/>
+                <w14:ligatures w14:val="none"/>
               </w:rPr>
             </w:pPr>
             <w:r>
@@ -10077,13 +9984,13 @@
                 <w:b/>
                 <w:bCs/>
               </w:rPr>
-              <w:t>Phân hệ</w:t>
-            </w:r>
-          </w:p>
-        </w:tc>
-        <w:tc>
-          <w:tcPr>
-            <w:tcW w:w="2410" w:type="dxa"/>
+              <w:t>Nhóm đối tượng nghiệp vụ</w:t>
+            </w:r>
+          </w:p>
+        </w:tc>
+        <w:tc>
+          <w:tcPr>
+            <w:tcW w:w="1701" w:type="dxa"/>
             <w:vAlign w:val="center"/>
           </w:tcPr>
           <w:p>
@@ -10093,6 +10000,7 @@
               <w:rPr>
                 <w:b/>
                 <w:bCs/>
+                <w:lang w:val="en-US"/>
               </w:rPr>
             </w:pPr>
             <w:r>
@@ -10100,13 +10008,21 @@
                 <w:b/>
                 <w:bCs/>
               </w:rPr>
-              <w:t>Đối tượng nghiệp vụ</w:t>
-            </w:r>
-          </w:p>
-        </w:tc>
-        <w:tc>
-          <w:tcPr>
-            <w:tcW w:w="4667" w:type="dxa"/>
+              <w:t>Đối tượn</w:t>
+            </w:r>
+            <w:r>
+              <w:rPr>
+                <w:b/>
+                <w:bCs/>
+                <w:lang w:val="en-US"/>
+              </w:rPr>
+              <w:t>g</w:t>
+            </w:r>
+          </w:p>
+        </w:tc>
+        <w:tc>
+          <w:tcPr>
+            <w:tcW w:w="5376" w:type="dxa"/>
             <w:vAlign w:val="center"/>
           </w:tcPr>
           <w:p>
@@ -10140,19 +10056,22 @@
               <w:jc w:val="left"/>
             </w:pPr>
             <w:r>
-              <w:t>Nhóm</w:t>
-            </w:r>
-            <w:r>
-              <w:rPr>
-                <w:bCs/>
-              </w:rPr>
-              <w:t xml:space="preserve"> định danh</w:t>
-            </w:r>
-          </w:p>
-        </w:tc>
-        <w:tc>
-          <w:tcPr>
-            <w:tcW w:w="2410" w:type="dxa"/>
+              <w:rPr>
+                <w:bCs/>
+              </w:rPr>
+              <w:t>Đ</w:t>
+            </w:r>
+            <w:r>
+              <w:rPr>
+                <w:bCs/>
+              </w:rPr>
+              <w:t>ịnh danh</w:t>
+            </w:r>
+          </w:p>
+        </w:tc>
+        <w:tc>
+          <w:tcPr>
+            <w:tcW w:w="1701" w:type="dxa"/>
             <w:vAlign w:val="center"/>
           </w:tcPr>
           <w:p>
@@ -10167,19 +10086,16 @@
         </w:tc>
         <w:tc>
           <w:tcPr>
-            <w:tcW w:w="4667" w:type="dxa"/>
-            <w:vAlign w:val="center"/>
-          </w:tcPr>
-          <w:p>
-            <w:pPr>
-              <w:spacing w:line="240" w:lineRule="auto"/>
-              <w:jc w:val="left"/>
-            </w:pPr>
-            <w:r>
-              <w:t>Bản ghi định danh duy nhất cho mỗi chủ thể được xác thực tham gia hệ thống (Admin, Organizer, Customer, Check-in Staff). Lưu giữ thông tin cơ bản gồm định danh tài khoản, Email, tên hiển thị và chuỗi băm xác thực mật khẩu</w:t>
-            </w:r>
-            <w:r>
-              <w:t>.</w:t>
+            <w:tcW w:w="5376" w:type="dxa"/>
+            <w:vAlign w:val="center"/>
+          </w:tcPr>
+          <w:p>
+            <w:pPr>
+              <w:spacing w:line="240" w:lineRule="auto"/>
+              <w:jc w:val="left"/>
+            </w:pPr>
+            <w:r>
+              <w:t>Tài khoản định danh người dùng, chứa thông tin tài khoản và vai trò được cấp để xác định phạm vi thực hiện nghiệp vụ.</w:t>
             </w:r>
           </w:p>
         </w:tc>
@@ -10197,13 +10113,16 @@
               <w:jc w:val="left"/>
             </w:pPr>
             <w:r>
-              <w:t>Nhóm sự kiện và nghệ sĩ</w:t>
-            </w:r>
-          </w:p>
-        </w:tc>
-        <w:tc>
-          <w:tcPr>
-            <w:tcW w:w="2410" w:type="dxa"/>
+              <w:t>S</w:t>
+            </w:r>
+            <w:r>
+              <w:t>ự kiện và nghệ sĩ</w:t>
+            </w:r>
+          </w:p>
+        </w:tc>
+        <w:tc>
+          <w:tcPr>
+            <w:tcW w:w="1701" w:type="dxa"/>
             <w:vAlign w:val="center"/>
           </w:tcPr>
           <w:p>
@@ -10221,7 +10140,7 @@
         </w:tc>
         <w:tc>
           <w:tcPr>
-            <w:tcW w:w="4667" w:type="dxa"/>
+            <w:tcW w:w="5376" w:type="dxa"/>
             <w:vAlign w:val="center"/>
           </w:tcPr>
           <w:p>
@@ -10260,7 +10179,7 @@
         </w:tc>
         <w:tc>
           <w:tcPr>
-            <w:tcW w:w="2410" w:type="dxa"/>
+            <w:tcW w:w="1701" w:type="dxa"/>
             <w:vAlign w:val="center"/>
           </w:tcPr>
           <w:p>
@@ -10278,7 +10197,7 @@
         </w:tc>
         <w:tc>
           <w:tcPr>
-            <w:tcW w:w="4667" w:type="dxa"/>
+            <w:tcW w:w="5376" w:type="dxa"/>
             <w:vAlign w:val="center"/>
           </w:tcPr>
           <w:p>
@@ -10323,7 +10242,7 @@
         </w:tc>
         <w:tc>
           <w:tcPr>
-            <w:tcW w:w="2410" w:type="dxa"/>
+            <w:tcW w:w="1701" w:type="dxa"/>
             <w:vAlign w:val="center"/>
           </w:tcPr>
           <w:p>
@@ -10341,7 +10260,7 @@
         </w:tc>
         <w:tc>
           <w:tcPr>
-            <w:tcW w:w="4667" w:type="dxa"/>
+            <w:tcW w:w="5376" w:type="dxa"/>
             <w:vAlign w:val="center"/>
           </w:tcPr>
           <w:p>
@@ -10374,7 +10293,7 @@
         </w:tc>
         <w:tc>
           <w:tcPr>
-            <w:tcW w:w="2410" w:type="dxa"/>
+            <w:tcW w:w="1701" w:type="dxa"/>
             <w:vAlign w:val="center"/>
           </w:tcPr>
           <w:p>
@@ -10392,19 +10311,32 @@
         </w:tc>
         <w:tc>
           <w:tcPr>
-            <w:tcW w:w="4667" w:type="dxa"/>
-            <w:vAlign w:val="center"/>
-          </w:tcPr>
-          <w:p>
-            <w:pPr>
-              <w:spacing w:line="240" w:lineRule="auto"/>
-              <w:jc w:val="left"/>
-            </w:pPr>
-            <w:r>
-              <w:rPr>
-                <w:bCs/>
-              </w:rPr>
-              <w:t>Phân khu vật lý độc lập trong một Venue (ví dụ: Khán đài A, Khu vực đứng GA).</w:t>
+            <w:tcW w:w="5376" w:type="dxa"/>
+            <w:vAlign w:val="center"/>
+          </w:tcPr>
+          <w:p>
+            <w:pPr>
+              <w:spacing w:line="240" w:lineRule="auto"/>
+              <w:jc w:val="left"/>
+            </w:pPr>
+            <w:r>
+              <w:rPr>
+                <w:bCs/>
+              </w:rPr>
+              <w:t xml:space="preserve">Phân khu vật lý </w:t>
+            </w:r>
+            <w:r>
+              <w:rPr>
+                <w:bCs/>
+                <w:lang w:val="en-US"/>
+              </w:rPr>
+              <w:t>thuộc</w:t>
+            </w:r>
+            <w:r>
+              <w:rPr>
+                <w:bCs/>
+              </w:rPr>
+              <w:t xml:space="preserve"> một Venue (ví dụ: Khán đài A, Khu vực đứng GA).</w:t>
             </w:r>
           </w:p>
         </w:tc>
@@ -10425,7 +10357,7 @@
         </w:tc>
         <w:tc>
           <w:tcPr>
-            <w:tcW w:w="2410" w:type="dxa"/>
+            <w:tcW w:w="1701" w:type="dxa"/>
             <w:vAlign w:val="center"/>
           </w:tcPr>
           <w:p>
@@ -10443,19 +10375,32 @@
         </w:tc>
         <w:tc>
           <w:tcPr>
-            <w:tcW w:w="4667" w:type="dxa"/>
-            <w:vAlign w:val="center"/>
-          </w:tcPr>
-          <w:p>
-            <w:pPr>
-              <w:spacing w:line="240" w:lineRule="auto"/>
-              <w:jc w:val="left"/>
-            </w:pPr>
-            <w:r>
-              <w:rPr>
-                <w:bCs/>
-              </w:rPr>
-              <w:t>Vị trí ngồi vật lý tĩnh cụ thể nằm trong một Zone</w:t>
+            <w:tcW w:w="5376" w:type="dxa"/>
+            <w:vAlign w:val="center"/>
+          </w:tcPr>
+          <w:p>
+            <w:pPr>
+              <w:spacing w:line="240" w:lineRule="auto"/>
+              <w:jc w:val="left"/>
+            </w:pPr>
+            <w:r>
+              <w:rPr>
+                <w:bCs/>
+              </w:rPr>
+              <w:t xml:space="preserve">Vị trí ngồi vật lý tĩnh </w:t>
+            </w:r>
+            <w:r>
+              <w:rPr>
+                <w:bCs/>
+                <w:lang w:val="en-US"/>
+              </w:rPr>
+              <w:t>thuộc</w:t>
+            </w:r>
+            <w:r>
+              <w:rPr>
+                <w:bCs/>
+              </w:rPr>
+              <w:t xml:space="preserve"> một Zone</w:t>
             </w:r>
             <w:r>
               <w:rPr>
@@ -10494,7 +10439,7 @@
         </w:tc>
         <w:tc>
           <w:tcPr>
-            <w:tcW w:w="2410" w:type="dxa"/>
+            <w:tcW w:w="1701" w:type="dxa"/>
             <w:vAlign w:val="center"/>
           </w:tcPr>
           <w:p>
@@ -10512,7 +10457,7 @@
         </w:tc>
         <w:tc>
           <w:tcPr>
-            <w:tcW w:w="4667" w:type="dxa"/>
+            <w:tcW w:w="5376" w:type="dxa"/>
             <w:vAlign w:val="center"/>
           </w:tcPr>
           <w:p>
@@ -10545,7 +10490,7 @@
         </w:tc>
         <w:tc>
           <w:tcPr>
-            <w:tcW w:w="2410" w:type="dxa"/>
+            <w:tcW w:w="1701" w:type="dxa"/>
             <w:vAlign w:val="center"/>
           </w:tcPr>
           <w:p>
@@ -10563,7 +10508,7 @@
         </w:tc>
         <w:tc>
           <w:tcPr>
-            <w:tcW w:w="4667" w:type="dxa"/>
+            <w:tcW w:w="5376" w:type="dxa"/>
             <w:vAlign w:val="center"/>
           </w:tcPr>
           <w:p>
@@ -10602,7 +10547,7 @@
         </w:tc>
         <w:tc>
           <w:tcPr>
-            <w:tcW w:w="2410" w:type="dxa"/>
+            <w:tcW w:w="1701" w:type="dxa"/>
             <w:vAlign w:val="center"/>
           </w:tcPr>
           <w:p>
@@ -10620,7 +10565,7 @@
         </w:tc>
         <w:tc>
           <w:tcPr>
-            <w:tcW w:w="4667" w:type="dxa"/>
+            <w:tcW w:w="5376" w:type="dxa"/>
             <w:vAlign w:val="center"/>
           </w:tcPr>
           <w:p>
@@ -10695,7 +10640,7 @@
         </w:tc>
         <w:tc>
           <w:tcPr>
-            <w:tcW w:w="2410" w:type="dxa"/>
+            <w:tcW w:w="1701" w:type="dxa"/>
             <w:vAlign w:val="center"/>
           </w:tcPr>
           <w:p>
@@ -10716,7 +10661,7 @@
         </w:tc>
         <w:tc>
           <w:tcPr>
-            <w:tcW w:w="4667" w:type="dxa"/>
+            <w:tcW w:w="5376" w:type="dxa"/>
             <w:vAlign w:val="center"/>
           </w:tcPr>
           <w:p>
@@ -10755,7 +10700,7 @@
         </w:tc>
         <w:tc>
           <w:tcPr>
-            <w:tcW w:w="2410" w:type="dxa"/>
+            <w:tcW w:w="1701" w:type="dxa"/>
             <w:vAlign w:val="center"/>
           </w:tcPr>
           <w:p>
@@ -10776,7 +10721,7 @@
         </w:tc>
         <w:tc>
           <w:tcPr>
-            <w:tcW w:w="4667" w:type="dxa"/>
+            <w:tcW w:w="5376" w:type="dxa"/>
             <w:vAlign w:val="center"/>
           </w:tcPr>
           <w:p>
@@ -10815,7 +10760,7 @@
         </w:tc>
         <w:tc>
           <w:tcPr>
-            <w:tcW w:w="2410" w:type="dxa"/>
+            <w:tcW w:w="1701" w:type="dxa"/>
             <w:vAlign w:val="center"/>
           </w:tcPr>
           <w:p>
@@ -10836,7 +10781,7 @@
         </w:tc>
         <w:tc>
           <w:tcPr>
-            <w:tcW w:w="4667" w:type="dxa"/>
+            <w:tcW w:w="5376" w:type="dxa"/>
             <w:vAlign w:val="center"/>
           </w:tcPr>
           <w:p>
@@ -10881,7 +10826,7 @@
         </w:tc>
         <w:tc>
           <w:tcPr>
-            <w:tcW w:w="2410" w:type="dxa"/>
+            <w:tcW w:w="1701" w:type="dxa"/>
             <w:vAlign w:val="center"/>
           </w:tcPr>
           <w:p>
@@ -10902,7 +10847,7 @@
         </w:tc>
         <w:tc>
           <w:tcPr>
-            <w:tcW w:w="4667" w:type="dxa"/>
+            <w:tcW w:w="5376" w:type="dxa"/>
             <w:vAlign w:val="center"/>
           </w:tcPr>
           <w:p>
@@ -10941,7 +10886,7 @@
         </w:tc>
         <w:tc>
           <w:tcPr>
-            <w:tcW w:w="2410" w:type="dxa"/>
+            <w:tcW w:w="1701" w:type="dxa"/>
             <w:vAlign w:val="center"/>
           </w:tcPr>
           <w:p>
@@ -10962,7 +10907,7 @@
         </w:tc>
         <w:tc>
           <w:tcPr>
-            <w:tcW w:w="4667" w:type="dxa"/>
+            <w:tcW w:w="5376" w:type="dxa"/>
             <w:vAlign w:val="center"/>
           </w:tcPr>
           <w:p>
@@ -11001,7 +10946,7 @@
         </w:tc>
         <w:tc>
           <w:tcPr>
-            <w:tcW w:w="2410" w:type="dxa"/>
+            <w:tcW w:w="1701" w:type="dxa"/>
             <w:vAlign w:val="center"/>
           </w:tcPr>
           <w:p>
@@ -11022,7 +10967,7 @@
         </w:tc>
         <w:tc>
           <w:tcPr>
-            <w:tcW w:w="4667" w:type="dxa"/>
+            <w:tcW w:w="5376" w:type="dxa"/>
             <w:vAlign w:val="center"/>
           </w:tcPr>
           <w:p>
@@ -11061,7 +11006,7 @@
         </w:tc>
         <w:tc>
           <w:tcPr>
-            <w:tcW w:w="2410" w:type="dxa"/>
+            <w:tcW w:w="1701" w:type="dxa"/>
             <w:vAlign w:val="center"/>
           </w:tcPr>
           <w:p>
@@ -11082,7 +11027,7 @@
         </w:tc>
         <w:tc>
           <w:tcPr>
-            <w:tcW w:w="4667" w:type="dxa"/>
+            <w:tcW w:w="5376" w:type="dxa"/>
             <w:vAlign w:val="center"/>
           </w:tcPr>
           <w:p>
@@ -11136,7 +11081,7 @@
         </w:tc>
         <w:tc>
           <w:tcPr>
-            <w:tcW w:w="2410" w:type="dxa"/>
+            <w:tcW w:w="1701" w:type="dxa"/>
             <w:vAlign w:val="center"/>
           </w:tcPr>
           <w:p>
@@ -11157,7 +11102,7 @@
         </w:tc>
         <w:tc>
           <w:tcPr>
-            <w:tcW w:w="4667" w:type="dxa"/>
+            <w:tcW w:w="5376" w:type="dxa"/>
             <w:vAlign w:val="center"/>
           </w:tcPr>
           <w:p>
@@ -11196,7 +11141,7 @@
         </w:tc>
         <w:tc>
           <w:tcPr>
-            <w:tcW w:w="2410" w:type="dxa"/>
+            <w:tcW w:w="1701" w:type="dxa"/>
             <w:vAlign w:val="center"/>
           </w:tcPr>
           <w:p>
@@ -11217,7 +11162,7 @@
         </w:tc>
         <w:tc>
           <w:tcPr>
-            <w:tcW w:w="4667" w:type="dxa"/>
+            <w:tcW w:w="5376" w:type="dxa"/>
             <w:vAlign w:val="center"/>
           </w:tcPr>
           <w:p>
@@ -11259,7 +11204,6 @@
         <w:rPr>
           <w:lang w:val="vi-VN"/>
         </w:rPr>
-        <w:lastRenderedPageBreak/>
         <w:t>Trạng thái của đối tượng nghiệp vụ</w:t>
       </w:r>
       <w:bookmarkEnd w:id="33"/>
@@ -11537,6 +11481,7 @@
                 <w:rFonts w:cs="Times New Roman"/>
                 <w:b w:val="0"/>
               </w:rPr>
+              <w:lastRenderedPageBreak/>
               <w:t>→ </w:t>
             </w:r>
             <w:r>
@@ -12280,7 +12225,6 @@
               <w:rPr>
                 <w:b w:val="0"/>
               </w:rPr>
-              <w:lastRenderedPageBreak/>
               <w:t xml:space="preserve">Khóa nội bộ: BTC chủ động rút khỏi kho (BR08a) </w:t>
             </w:r>
           </w:p>
@@ -12546,6 +12490,7 @@
               <w:rPr>
                 <w:b w:val="0"/>
               </w:rPr>
+              <w:lastRenderedPageBreak/>
               <w:t>→ Available / OnHoldForWaitlist (cho người tiếp theo)</w:t>
             </w:r>
           </w:p>
@@ -13703,6 +13648,7 @@
               <w:jc w:val="left"/>
             </w:pPr>
             <w:r>
+              <w:lastRenderedPageBreak/>
               <w:t>Refund</w:t>
             </w:r>
           </w:p>
@@ -14440,7 +14386,6 @@
                 <w:b w:val="0"/>
                 <w:bCs/>
               </w:rPr>
-              <w:lastRenderedPageBreak/>
               <w:t xml:space="preserve">Sự kiện bị hủy: Hủy Concert kích hoạt đóng Waitlist tự động (BR44a) </w:t>
             </w:r>
           </w:p>
@@ -15806,6 +15751,7 @@
         <w:rPr>
           <w:lang w:val="vi-VN"/>
         </w:rPr>
+        <w:lastRenderedPageBreak/>
         <w:t>Quy trình nghiệp vụ</w:t>
       </w:r>
       <w:bookmarkEnd w:id="34"/>
@@ -15970,11 +15916,7 @@
         <w:t>Cấp cơ hội nguyên tử</w:t>
       </w:r>
       <w:r>
-        <w:t xml:space="preserve">: Tiến trình tự động Waitlist (SIP4) quét danh sách theo chính sách FIFO/RANDOM. SIP4 chỉ thực hiện duyệt (Granted) cho duy nhất một Waitlist </w:t>
-      </w:r>
-      <w:r>
-        <w:lastRenderedPageBreak/>
-        <w:t>Entry đứng đầu danh sách, và CHỈ KHI tổng số ghế đang tích lũy của hạng vé đó đủ đáp ứng trọn vẹn số lượng yêu cầu.</w:t>
+        <w:t>: Tiến trình tự động Waitlist (SIP4) quét danh sách theo chính sách FIFO/RANDOM. SIP4 chỉ thực hiện duyệt (Granted) cho duy nhất một Waitlist Entry đứng đầu danh sách, và CHỈ KHI tổng số ghế đang tích lũy của hạng vé đó đủ đáp ứng trọn vẹn số lượng yêu cầu.</w:t>
       </w:r>
     </w:p>
     <w:p>
@@ -16019,7 +15961,15 @@
           <w:b w:val="0"/>
           <w:bCs/>
         </w:rPr>
-        <w:t xml:space="preserve"> Khi được duyệt Granted, toàn bộ tập hợp ghế vật lý đang tích lũy sẽ được gán cứng sang giai đoạn đã cấp (granted) cho lượt Waitlist đó, và đồng hồ cơ hội mua vé 15 phút bắt đầu đếm ngược. Nếu khách tạo Booking thành công, ghế chuyển sang OnHold của Booking mới với Temporary Hold đầy đủ; nếu quá 15 phút cơ hội bị Expired, toàn bộ ghế được giải phóng trở lại giai đoạn tích lũy để xét duyệt cho lượt tiếp theo.</w:t>
+        <w:t xml:space="preserve"> Khi được duyệt Granted, toàn bộ tập hợp ghế vật lý đang tích lũy sẽ được gán cứng sang giai đoạn đã cấp (granted) cho lượt Waitlist đó, và đồng hồ cơ hội mua vé 15 phút bắt đầu đếm ngược. Nếu khách tạo Booking thành công, ghế chuyển </w:t>
+      </w:r>
+      <w:r>
+        <w:rPr>
+          <w:b w:val="0"/>
+          <w:bCs/>
+        </w:rPr>
+        <w:lastRenderedPageBreak/>
+        <w:t>sang OnHold của Booking mới với Temporary Hold đầy đủ; nếu quá 15 phút cơ hội bị Expired, toàn bộ ghế được giải phóng trở lại giai đoạn tích lũy để xét duyệt cho lượt tiếp theo.</w:t>
       </w:r>
     </w:p>
     <w:p>
@@ -28698,7 +28648,6 @@
   <w:style w:type="character" w:default="1" w:styleId="DefaultParagraphFont">
     <w:name w:val="Default Paragraph Font"/>
     <w:uiPriority w:val="1"/>
-    <w:semiHidden/>
     <w:unhideWhenUsed/>
   </w:style>
   <w:style w:type="table" w:default="1" w:styleId="TableNormal">

</xml_diff>